<commit_message>
docs: how to add a story; the poker guide follows the move
README replaces the template text with the folder layout, the commands, the
steps for a new story and what the designer's videos must be. The poker site
guide names the new paths and commands.

Co-Authored-By: Claude Opus 5.5 <noreply@anthropic.com>
</commit_message>
<xml_diff>
--- a/stories/poker/POKER_STORY_INTEGRATION_UA.docx
+++ b/stories/poker/POKER_STORY_INTEGRATION_UA.docx
@@ -3737,7 +3737,7 @@
           <w:szCs w:val="22"/>
           <w:shd w:fill="F0F0F0" w:val="clear"/>
         </w:rPr>
-        <w:t xml:space="preserve">src/data/stories.json</w:t>
+        <w:t xml:space="preserve">stories/poker/stories.json</w:t>
       </w:r>
       <w:r>
         <w:rPr>
@@ -7018,7 +7018,7 @@
           <w:szCs w:val="22"/>
           <w:shd w:fill="F0F0F0" w:val="clear"/>
         </w:rPr>
-        <w:t xml:space="preserve">dist/</w:t>
+        <w:t xml:space="preserve">dist/poker/</w:t>
       </w:r>
       <w:r>
         <w:rPr>
@@ -7202,6 +7202,70 @@
     </w:p>
     <w:p>
       <w:pPr>
+        <w:spacing w:after="140" w:line="300"/>
+      </w:pPr>
+      <w:r>
+        <w:rPr>
+          <w:rFonts w:ascii="Arial" w:cs="Arial" w:eastAsia="Arial" w:hAnsi="Arial"/>
+          <w:sz w:val="22"/>
+          <w:szCs w:val="22"/>
+        </w:rPr>
+        <w:t xml:space="preserve">Усі файли сторіс лежать у папці </w:t>
+      </w:r>
+      <w:r>
+        <w:rPr>
+          <w:rFonts w:ascii="Menlo" w:cs="Menlo" w:eastAsia="Menlo" w:hAnsi="Menlo"/>
+          <w:sz w:val="22"/>
+          <w:szCs w:val="22"/>
+          <w:shd w:fill="F0F0F0" w:val="clear"/>
+        </w:rPr>
+        <w:t xml:space="preserve">stories/poker/</w:t>
+      </w:r>
+      <w:r>
+        <w:rPr>
+          <w:rFonts w:ascii="Arial" w:cs="Arial" w:eastAsia="Arial" w:hAnsi="Arial"/>
+          <w:sz w:val="22"/>
+          <w:szCs w:val="22"/>
+        </w:rPr>
+        <w:t xml:space="preserve">: тексти (</w:t>
+      </w:r>
+      <w:r>
+        <w:rPr>
+          <w:rFonts w:ascii="Menlo" w:cs="Menlo" w:eastAsia="Menlo" w:hAnsi="Menlo"/>
+          <w:sz w:val="22"/>
+          <w:szCs w:val="22"/>
+          <w:shd w:fill="F0F0F0" w:val="clear"/>
+        </w:rPr>
+        <w:t xml:space="preserve">stories.json</w:t>
+      </w:r>
+      <w:r>
+        <w:rPr>
+          <w:rFonts w:ascii="Arial" w:cs="Arial" w:eastAsia="Arial" w:hAnsi="Arial"/>
+          <w:sz w:val="22"/>
+          <w:szCs w:val="22"/>
+        </w:rPr>
+        <w:t xml:space="preserve">), кольори та розміри шрифту (</w:t>
+      </w:r>
+      <w:r>
+        <w:rPr>
+          <w:rFonts w:ascii="Menlo" w:cs="Menlo" w:eastAsia="Menlo" w:hAnsi="Menlo"/>
+          <w:sz w:val="22"/>
+          <w:szCs w:val="22"/>
+          <w:shd w:fill="F0F0F0" w:val="clear"/>
+        </w:rPr>
+        <w:t xml:space="preserve">story.scss</w:t>
+      </w:r>
+      <w:r>
+        <w:rPr>
+          <w:rFonts w:ascii="Arial" w:cs="Arial" w:eastAsia="Arial" w:hAnsi="Arial"/>
+          <w:sz w:val="22"/>
+          <w:szCs w:val="22"/>
+        </w:rPr>
+        <w:t xml:space="preserve">), іконка, відео і звіт про відео. Код сторіс спільний для всіх сторіс проєкту.</w:t>
+      </w:r>
+    </w:p>
+    <w:p>
+      <w:pPr>
         <w:shd w:fill="F4F4F4" w:val="clear"/>
         <w:spacing w:after="0" w:before="80" w:line="260"/>
         <w:ind w:left="140"/>
@@ -7272,7 +7336,7 @@
           <w:sz w:val="17"/>
           <w:szCs w:val="17"/>
         </w:rPr>
-        <w:t xml:space="preserve">npm run dev</w:t>
+        <w:t xml:space="preserve">npm run dev poker</w:t>
       </w:r>
     </w:p>
     <w:p>
@@ -7302,7 +7366,7 @@
           <w:sz w:val="17"/>
           <w:szCs w:val="17"/>
         </w:rPr>
-        <w:t xml:space="preserve"># Збірка для продакшену</w:t>
+        <w:t xml:space="preserve"># Збірка для продакшену — результат у dist/poker/</w:t>
       </w:r>
     </w:p>
     <w:p>
@@ -7317,7 +7381,7 @@
           <w:sz w:val="17"/>
           <w:szCs w:val="17"/>
         </w:rPr>
-        <w:t xml:space="preserve">npm run build</w:t>
+        <w:t xml:space="preserve">npm run build poker</w:t>
       </w:r>
     </w:p>
     <w:p>
@@ -7362,7 +7426,7 @@
           <w:sz w:val="17"/>
           <w:szCs w:val="17"/>
         </w:rPr>
-        <w:t xml:space="preserve">npm run preview</w:t>
+        <w:t xml:space="preserve">npm run preview poker</w:t>
       </w:r>
     </w:p>
     <w:p>
@@ -7395,7 +7459,7 @@
           <w:szCs w:val="22"/>
           <w:shd w:fill="F0F0F0" w:val="clear"/>
         </w:rPr>
-        <w:t xml:space="preserve">src/assets/videos/stories/en/</w:t>
+        <w:t xml:space="preserve">stories/poker/videos/</w:t>
       </w:r>
       <w:r>
         <w:rPr>
@@ -7435,7 +7499,7 @@
           <w:sz w:val="17"/>
           <w:szCs w:val="17"/>
         </w:rPr>
-        <w:t xml:space="preserve">npm run video:encode -- --src &lt;папка з вихідними файлами&gt; --jobs 1</w:t>
+        <w:t xml:space="preserve">npm run video:encode -- --story poker --src &lt;папка з вихідними файлами&gt;</w:t>
       </w:r>
     </w:p>
     <w:p>
@@ -7522,7 +7586,7 @@
           <w:sz w:val="22"/>
           <w:szCs w:val="22"/>
         </w:rPr>
-        <w:t xml:space="preserve">Скрипт створює обидва розміри і всі чотири формати та підбирає стиснення окремо для кожного відео: найменший файл, якість якого не нижча за поріг.</w:t>
+        <w:t xml:space="preserve">Скрипт створює обидва розміри і всі чотири формати та підбирає стиснення окремо для кожного відео: найменший файл, якість якого не нижча за поріг. Відео обробляються по одному, щоб не перевантажувати комп'ютер.</w:t>
       </w:r>
     </w:p>
     <w:p>
@@ -7540,6 +7604,75 @@
           <w:sz w:val="22"/>
           <w:szCs w:val="22"/>
         </w:rPr>
+        <w:t xml:space="preserve">Сторіс знаходить файли за назвою кліпу (</w:t>
+      </w:r>
+      <w:r>
+        <w:rPr>
+          <w:rFonts w:ascii="Menlo" w:cs="Menlo" w:eastAsia="Menlo" w:hAnsi="Menlo"/>
+          <w:sz w:val="22"/>
+          <w:szCs w:val="22"/>
+          <w:shd w:fill="F0F0F0" w:val="clear"/>
+        </w:rPr>
+        <w:t xml:space="preserve">story_1</w:t>
+      </w:r>
+      <w:r>
+        <w:rPr>
+          <w:rFonts w:ascii="Arial" w:cs="Arial" w:eastAsia="Arial" w:hAnsi="Arial"/>
+          <w:sz w:val="22"/>
+          <w:szCs w:val="22"/>
+        </w:rPr>
+        <w:t xml:space="preserve">, </w:t>
+      </w:r>
+      <w:r>
+        <w:rPr>
+          <w:rFonts w:ascii="Menlo" w:cs="Menlo" w:eastAsia="Menlo" w:hAnsi="Menlo"/>
+          <w:sz w:val="22"/>
+          <w:szCs w:val="22"/>
+          <w:shd w:fill="F0F0F0" w:val="clear"/>
+        </w:rPr>
+        <w:t xml:space="preserve">story_2</w:t>
+      </w:r>
+      <w:r>
+        <w:rPr>
+          <w:rFonts w:ascii="Arial" w:cs="Arial" w:eastAsia="Arial" w:hAnsi="Arial"/>
+          <w:sz w:val="22"/>
+          <w:szCs w:val="22"/>
+        </w:rPr>
+        <w:t xml:space="preserve">…), тому шляхи до відео в </w:t>
+      </w:r>
+      <w:r>
+        <w:rPr>
+          <w:rFonts w:ascii="Menlo" w:cs="Menlo" w:eastAsia="Menlo" w:hAnsi="Menlo"/>
+          <w:sz w:val="22"/>
+          <w:szCs w:val="22"/>
+          <w:shd w:fill="F0F0F0" w:val="clear"/>
+        </w:rPr>
+        <w:t xml:space="preserve">stories.json</w:t>
+      </w:r>
+      <w:r>
+        <w:rPr>
+          <w:rFonts w:ascii="Arial" w:cs="Arial" w:eastAsia="Arial" w:hAnsi="Arial"/>
+          <w:sz w:val="22"/>
+          <w:szCs w:val="22"/>
+        </w:rPr>
+        <w:t xml:space="preserve"> не прописуються.</w:t>
+      </w:r>
+    </w:p>
+    <w:p>
+      <w:pPr>
+        <w:pStyle w:val="ListParagraph"/>
+        <w:numPr>
+          <w:ilvl w:val="0"/>
+          <w:numId w:val="2"/>
+        </w:numPr>
+        <w:spacing w:after="60"/>
+      </w:pPr>
+      <w:r>
+        <w:rPr>
+          <w:rFonts w:ascii="Arial" w:cs="Arial" w:eastAsia="Arial" w:hAnsi="Arial"/>
+          <w:sz w:val="22"/>
+          <w:szCs w:val="22"/>
+        </w:rPr>
         <w:t xml:space="preserve">Результати записуються у </w:t>
       </w:r>
       <w:r>
@@ -7549,32 +7682,15 @@
           <w:szCs w:val="22"/>
           <w:shd w:fill="F0F0F0" w:val="clear"/>
         </w:rPr>
-        <w:t xml:space="preserve">docs/poker-video-report.json</w:t>
-      </w:r>
-      <w:r>
-        <w:rPr>
-          <w:rFonts w:ascii="Arial" w:cs="Arial" w:eastAsia="Arial" w:hAnsi="Arial"/>
-          <w:sz w:val="22"/>
-          <w:szCs w:val="22"/>
-        </w:rPr>
-        <w:t xml:space="preserve">: вага, оцінка якості, тип джерела кожного файлу. Назва звіту береться з назви сторіс у </w:t>
-      </w:r>
-      <w:r>
-        <w:rPr>
-          <w:rFonts w:ascii="Menlo" w:cs="Menlo" w:eastAsia="Menlo" w:hAnsi="Menlo"/>
-          <w:sz w:val="22"/>
-          <w:szCs w:val="22"/>
-          <w:shd w:fill="F0F0F0" w:val="clear"/>
-        </w:rPr>
-        <w:t xml:space="preserve">src/data/stories.json</w:t>
-      </w:r>
-      <w:r>
-        <w:rPr>
-          <w:rFonts w:ascii="Arial" w:cs="Arial" w:eastAsia="Arial" w:hAnsi="Arial"/>
-          <w:sz w:val="22"/>
-          <w:szCs w:val="22"/>
-        </w:rPr>
-        <w:t xml:space="preserve">.</w:t>
+        <w:t xml:space="preserve">stories/poker/video-report.json</w:t>
+      </w:r>
+      <w:r>
+        <w:rPr>
+          <w:rFonts w:ascii="Arial" w:cs="Arial" w:eastAsia="Arial" w:hAnsi="Arial"/>
+          <w:sz w:val="22"/>
+          <w:szCs w:val="22"/>
+        </w:rPr>
+        <w:t xml:space="preserve">: вага, оцінка якості, тип джерела кожного файлу.</w:t>
       </w:r>
     </w:p>
     <w:p>

</xml_diff>

<commit_message>
docs: the story music track in the README and the poker integration guide
How the track is built and played, the commands, and for the site: the
music files, their sizes and the clip sizes without sound.

Co-Authored-By: Claude Opus 5.5 <noreply@anthropic.com>
</commit_message>
<xml_diff>
--- a/stories/poker/POKER_STORY_INTEGRATION_UA.docx
+++ b/stories/poker/POKER_STORY_INTEGRATION_UA.docx
@@ -250,7 +250,7 @@
           <w:sz w:val="22"/>
           <w:szCs w:val="22"/>
         </w:rPr>
-        <w:t xml:space="preserve">Відео запускається автоматично без звуку. Звук вмикає користувач кнопкою в шапці сторіс.</w:t>
+        <w:t xml:space="preserve">Відео запускається автоматично без звуку. Звук вмикає користувач кнопкою в шапці сторіс. Музика грає з окремого файлу й не переривається під час переходу між слайдами (див. «Музика»).</w:t>
       </w:r>
     </w:p>
     <w:p>
@@ -5120,7 +5120,7 @@
                 <w:szCs w:val="20"/>
                 <w:shd w:fill="F0F0F0" w:val="clear"/>
               </w:rPr>
-              <w:t xml:space="preserve">video/mp4; codecs="av01.0.08M.08, mp4a.40.2"</w:t>
+              <w:t xml:space="preserve">video/mp4; codecs="av01.0.08M.08"</w:t>
             </w:r>
           </w:p>
         </w:tc>
@@ -5148,7 +5148,7 @@
                 <w:szCs w:val="20"/>
                 <w:shd w:fill="F0F0F0" w:val="clear"/>
               </w:rPr>
-              <w:t xml:space="preserve">video/mp4; codecs="av01.0.05M.08, mp4a.40.2"</w:t>
+              <w:t xml:space="preserve">video/mp4; codecs="av01.0.05M.08"</w:t>
             </w:r>
           </w:p>
         </w:tc>
@@ -5208,7 +5208,7 @@
                 <w:szCs w:val="20"/>
                 <w:shd w:fill="F0F0F0" w:val="clear"/>
               </w:rPr>
-              <w:t xml:space="preserve">video/mp4; codecs="hvc1.1.6.L120.90, mp4a.40.2"</w:t>
+              <w:t xml:space="preserve">video/mp4; codecs="hvc1.1.6.L120.90"</w:t>
             </w:r>
           </w:p>
         </w:tc>
@@ -5236,7 +5236,7 @@
                 <w:szCs w:val="20"/>
                 <w:shd w:fill="F0F0F0" w:val="clear"/>
               </w:rPr>
-              <w:t xml:space="preserve">video/mp4; codecs="hvc1.1.6.L93.90, mp4a.40.2"</w:t>
+              <w:t xml:space="preserve">video/mp4; codecs="hvc1.1.6.L93.90"</w:t>
             </w:r>
           </w:p>
         </w:tc>
@@ -5296,7 +5296,7 @@
                 <w:szCs w:val="20"/>
                 <w:shd w:fill="F0F0F0" w:val="clear"/>
               </w:rPr>
-              <w:t xml:space="preserve">video/mp4; codecs="avc1.640028, mp4a.40.2"</w:t>
+              <w:t xml:space="preserve">video/mp4; codecs="avc1.640028"</w:t>
             </w:r>
           </w:p>
         </w:tc>
@@ -5324,7 +5324,7 @@
                 <w:szCs w:val="20"/>
                 <w:shd w:fill="F0F0F0" w:val="clear"/>
               </w:rPr>
-              <w:t xml:space="preserve">video/mp4; codecs="avc1.64001F, mp4a.40.2"</w:t>
+              <w:t xml:space="preserve">video/mp4; codecs="avc1.64001F"</w:t>
             </w:r>
           </w:p>
         </w:tc>
@@ -5384,7 +5384,7 @@
                 <w:szCs w:val="20"/>
                 <w:shd w:fill="F0F0F0" w:val="clear"/>
               </w:rPr>
-              <w:t xml:space="preserve">video/webm; codecs="vp09.00.40.08, opus"</w:t>
+              <w:t xml:space="preserve">video/webm; codecs="vp09.00.40.08"</w:t>
             </w:r>
           </w:p>
         </w:tc>
@@ -5412,7 +5412,7 @@
                 <w:szCs w:val="20"/>
                 <w:shd w:fill="F0F0F0" w:val="clear"/>
               </w:rPr>
-              <w:t xml:space="preserve">video/webm; codecs="vp09.00.31.08, opus"</w:t>
+              <w:t xml:space="preserve">video/webm; codecs="vp09.00.31.08"</w:t>
             </w:r>
           </w:p>
         </w:tc>
@@ -5446,7 +5446,7 @@
           <w:sz w:val="22"/>
           <w:szCs w:val="22"/>
         </w:rPr>
-        <w:t xml:space="preserve">Параметри всіх файлів: 30 кадрів за секунду, зі звуковою доріжкою.</w:t>
+        <w:t xml:space="preserve">Параметри всіх файлів: 30 кадрів за секунду, без звукової доріжки: звук сторіс грає з окремого файлу (див. «Музика»).</w:t>
       </w:r>
     </w:p>
     <w:p>
@@ -5701,7 +5701,7 @@
                 <w:sz w:val="20"/>
                 <w:szCs w:val="20"/>
               </w:rPr>
-              <w:t xml:space="preserve">2,88 / 2,04</w:t>
+              <w:t xml:space="preserve">2,60 / 1,77</w:t>
             </w:r>
           </w:p>
         </w:tc>
@@ -5728,7 +5728,7 @@
                 <w:sz w:val="20"/>
                 <w:szCs w:val="20"/>
               </w:rPr>
-              <w:t xml:space="preserve">2,76 / 1,85</w:t>
+              <w:t xml:space="preserve">2,49 / 1,58</w:t>
             </w:r>
           </w:p>
         </w:tc>
@@ -5755,7 +5755,7 @@
                 <w:sz w:val="20"/>
                 <w:szCs w:val="20"/>
               </w:rPr>
-              <w:t xml:space="preserve">4,79 / 2,92</w:t>
+              <w:t xml:space="preserve">4,52 / 2,65</w:t>
             </w:r>
           </w:p>
         </w:tc>
@@ -5782,7 +5782,7 @@
                 <w:sz w:val="20"/>
                 <w:szCs w:val="20"/>
               </w:rPr>
-              <w:t xml:space="preserve">4,83 / 3,15</w:t>
+              <w:t xml:space="preserve">4,61 / 2,93</w:t>
             </w:r>
           </w:p>
         </w:tc>
@@ -5841,7 +5841,7 @@
                 <w:sz w:val="20"/>
                 <w:szCs w:val="20"/>
               </w:rPr>
-              <w:t xml:space="preserve">2,99 / 2,02</w:t>
+              <w:t xml:space="preserve">2,43 / 1,46</w:t>
             </w:r>
           </w:p>
         </w:tc>
@@ -5868,7 +5868,7 @@
                 <w:sz w:val="20"/>
                 <w:szCs w:val="20"/>
               </w:rPr>
-              <w:t xml:space="preserve">3,66 / 2,35</w:t>
+              <w:t xml:space="preserve">3,10 / 1,79</w:t>
             </w:r>
           </w:p>
         </w:tc>
@@ -5895,7 +5895,7 @@
                 <w:sz w:val="20"/>
                 <w:szCs w:val="20"/>
               </w:rPr>
-              <w:t xml:space="preserve">4,97 / 3,14</w:t>
+              <w:t xml:space="preserve">4,41 / 2,58</w:t>
             </w:r>
           </w:p>
         </w:tc>
@@ -5922,7 +5922,7 @@
                 <w:sz w:val="20"/>
                 <w:szCs w:val="20"/>
               </w:rPr>
-              <w:t xml:space="preserve">4,07 / 2,43</w:t>
+              <w:t xml:space="preserve">3,60 / 1,96</w:t>
             </w:r>
           </w:p>
         </w:tc>
@@ -5981,7 +5981,7 @@
                 <w:sz w:val="20"/>
                 <w:szCs w:val="20"/>
               </w:rPr>
-              <w:t xml:space="preserve">0,33 / 0,25</w:t>
+              <w:t xml:space="preserve">0,24 / 0,16</w:t>
             </w:r>
           </w:p>
         </w:tc>
@@ -6008,7 +6008,7 @@
                 <w:sz w:val="20"/>
                 <w:szCs w:val="20"/>
               </w:rPr>
-              <w:t xml:space="preserve">0,53 / 0,33</w:t>
+              <w:t xml:space="preserve">0,44 / 0,24</w:t>
             </w:r>
           </w:p>
         </w:tc>
@@ -6035,7 +6035,7 @@
                 <w:sz w:val="20"/>
                 <w:szCs w:val="20"/>
               </w:rPr>
-              <w:t xml:space="preserve">0,67 / 0,46</w:t>
+              <w:t xml:space="preserve">0,58 / 0,37</w:t>
             </w:r>
           </w:p>
         </w:tc>
@@ -6062,7 +6062,7 @@
                 <w:sz w:val="20"/>
                 <w:szCs w:val="20"/>
               </w:rPr>
-              <w:t xml:space="preserve">0,44 / 0,29</w:t>
+              <w:t xml:space="preserve">0,36 / 0,21</w:t>
             </w:r>
           </w:p>
         </w:tc>
@@ -6121,7 +6121,7 @@
                 <w:sz w:val="20"/>
                 <w:szCs w:val="20"/>
               </w:rPr>
-              <w:t xml:space="preserve">0,35 / 0,28</w:t>
+              <w:t xml:space="preserve">0,23 / 0,16</w:t>
             </w:r>
           </w:p>
         </w:tc>
@@ -6148,7 +6148,7 @@
                 <w:sz w:val="20"/>
                 <w:szCs w:val="20"/>
               </w:rPr>
-              <w:t xml:space="preserve">0,73 / 0,36</w:t>
+              <w:t xml:space="preserve">0,61 / 0,24</w:t>
             </w:r>
           </w:p>
         </w:tc>
@@ -6175,7 +6175,7 @@
                 <w:sz w:val="20"/>
                 <w:szCs w:val="20"/>
               </w:rPr>
-              <w:t xml:space="preserve">0,74 / 0,43</w:t>
+              <w:t xml:space="preserve">0,62 / 0,31</w:t>
             </w:r>
           </w:p>
         </w:tc>
@@ -6202,7 +6202,7 @@
                 <w:sz w:val="20"/>
                 <w:szCs w:val="20"/>
               </w:rPr>
-              <w:t xml:space="preserve">0,44 / 0,30</w:t>
+              <w:t xml:space="preserve">0,34 / 0,20</w:t>
             </w:r>
           </w:p>
         </w:tc>
@@ -6261,7 +6261,7 @@
                 <w:sz w:val="20"/>
                 <w:szCs w:val="20"/>
               </w:rPr>
-              <w:t xml:space="preserve">0,60 / 0,45</w:t>
+              <w:t xml:space="preserve">0,47 / 0,31</w:t>
             </w:r>
           </w:p>
         </w:tc>
@@ -6288,7 +6288,7 @@
                 <w:sz w:val="20"/>
                 <w:szCs w:val="20"/>
               </w:rPr>
-              <w:t xml:space="preserve">0,78 / 0,52</w:t>
+              <w:t xml:space="preserve">0,65 / 0,39</w:t>
             </w:r>
           </w:p>
         </w:tc>
@@ -6315,7 +6315,7 @@
                 <w:sz w:val="20"/>
                 <w:szCs w:val="20"/>
               </w:rPr>
-              <w:t xml:space="preserve">1,13 / 0,67</w:t>
+              <w:t xml:space="preserve">1,00 / 0,54</w:t>
             </w:r>
           </w:p>
         </w:tc>
@@ -6342,7 +6342,7 @@
                 <w:sz w:val="20"/>
                 <w:szCs w:val="20"/>
               </w:rPr>
-              <w:t xml:space="preserve">0,80 / 0,54</w:t>
+              <w:t xml:space="preserve">0,68 / 0,43</w:t>
             </w:r>
           </w:p>
         </w:tc>
@@ -6401,7 +6401,7 @@
                 <w:sz w:val="20"/>
                 <w:szCs w:val="20"/>
               </w:rPr>
-              <w:t xml:space="preserve">1,07 / 0,83</w:t>
+              <w:t xml:space="preserve">0,80 / 0,55</w:t>
             </w:r>
           </w:p>
         </w:tc>
@@ -6428,7 +6428,7 @@
                 <w:sz w:val="20"/>
                 <w:szCs w:val="20"/>
               </w:rPr>
-              <w:t xml:space="preserve">1,41 / 0,98</w:t>
+              <w:t xml:space="preserve">1,14 / 0,70</w:t>
             </w:r>
           </w:p>
         </w:tc>
@@ -6455,7 +6455,7 @@
                 <w:sz w:val="20"/>
                 <w:szCs w:val="20"/>
               </w:rPr>
-              <w:t xml:space="preserve">2,10 / 1,24</w:t>
+              <w:t xml:space="preserve">1,82 / 0,96</w:t>
             </w:r>
           </w:p>
         </w:tc>
@@ -6482,7 +6482,7 @@
                 <w:sz w:val="20"/>
                 <w:szCs w:val="20"/>
               </w:rPr>
-              <w:t xml:space="preserve">1,34 / 0,93</w:t>
+              <w:t xml:space="preserve">1,12 / 0,70</w:t>
             </w:r>
           </w:p>
         </w:tc>
@@ -6541,7 +6541,7 @@
                 <w:sz w:val="20"/>
                 <w:szCs w:val="20"/>
               </w:rPr>
-              <w:t xml:space="preserve">1,01 / 0,77</w:t>
+              <w:t xml:space="preserve">0,84 / 0,60</w:t>
             </w:r>
           </w:p>
         </w:tc>
@@ -6568,7 +6568,7 @@
                 <w:sz w:val="20"/>
                 <w:szCs w:val="20"/>
               </w:rPr>
-              <w:t xml:space="preserve">1,34 / 0,84</w:t>
+              <w:t xml:space="preserve">1,17 / 0,67</w:t>
             </w:r>
           </w:p>
         </w:tc>
@@ -6595,7 +6595,7 @@
                 <w:sz w:val="20"/>
                 <w:szCs w:val="20"/>
               </w:rPr>
-              <w:t xml:space="preserve">1,71 / 1,05</w:t>
+              <w:t xml:space="preserve">1,53 / 0,88</w:t>
             </w:r>
           </w:p>
         </w:tc>
@@ -6622,7 +6622,7 @@
                 <w:sz w:val="20"/>
                 <w:szCs w:val="20"/>
               </w:rPr>
-              <w:t xml:space="preserve">1,97 / 1,35</w:t>
+              <w:t xml:space="preserve">1,82 / 1,19</w:t>
             </w:r>
           </w:p>
         </w:tc>
@@ -6681,7 +6681,7 @@
                 <w:sz w:val="20"/>
                 <w:szCs w:val="20"/>
               </w:rPr>
-              <w:t xml:space="preserve">9,23 / 6,63</w:t>
+              <w:t xml:space="preserve">7,60 / 5,01</w:t>
             </w:r>
           </w:p>
         </w:tc>
@@ -6708,7 +6708,7 @@
                 <w:sz w:val="20"/>
                 <w:szCs w:val="20"/>
               </w:rPr>
-              <w:t xml:space="preserve">11,20 / 7,24</w:t>
+              <w:t xml:space="preserve">9,58 / 5,62</w:t>
             </w:r>
           </w:p>
         </w:tc>
@@ -6735,7 +6735,7 @@
                 <w:sz w:val="20"/>
                 <w:szCs w:val="20"/>
               </w:rPr>
-              <w:t xml:space="preserve">16,11 / 9,90</w:t>
+              <w:t xml:space="preserve">14,49 / 8,28</w:t>
             </w:r>
           </w:p>
         </w:tc>
@@ -6762,7 +6762,7 @@
                 <w:sz w:val="20"/>
                 <w:szCs w:val="20"/>
               </w:rPr>
-              <w:t xml:space="preserve">13,89 / 8,98</w:t>
+              <w:t xml:space="preserve">12,53 / 7,62</w:t>
             </w:r>
           </w:p>
         </w:tc>
@@ -6783,7 +6783,7 @@
           <w:sz w:val="22"/>
           <w:szCs w:val="22"/>
         </w:rPr>
-        <w:t xml:space="preserve">Версія 720 легша за 1080 на 28–39 % залежно від формату. Поріг якості для обох розмірів однаковий.</w:t>
+        <w:t xml:space="preserve">Версія 720 легша за 1080 на 34–43 % залежно від формату. Поріг якості для обох розмірів однаковий.</w:t>
       </w:r>
     </w:p>
     <w:p>
@@ -6796,7 +6796,7 @@
           <w:sz w:val="22"/>
           <w:szCs w:val="22"/>
         </w:rPr>
-        <w:t xml:space="preserve">Користувач завантажує файли лише одного розміру й одного формату. Наступне відео починає завантажуватися заздалегідь, поки відтворюється поточне.</w:t>
+        <w:t xml:space="preserve">Користувач завантажує файли лише одного розміру й одного формату. Наступне відео завантажується в пам'ять заздалегідь, поки відтворюється поточне, і після переходу починається одразу.</w:t>
       </w:r>
     </w:p>
     <w:p>
@@ -6807,19 +6807,313 @@
         <w:rPr>
           <w:rFonts w:ascii="Arial" w:cs="Arial" w:eastAsia="Arial" w:hAnsi="Arial"/>
         </w:rPr>
-        <w:t xml:space="preserve">Технічні деталі</w:t>
-      </w:r>
-    </w:p>
-    <w:p>
-      <w:pPr>
-        <w:pStyle w:val="Heading2"/>
-      </w:pPr>
-      <w:r>
-        <w:rPr>
-          <w:rFonts w:ascii="Arial" w:cs="Arial" w:eastAsia="Arial" w:hAnsi="Arial"/>
-        </w:rPr>
-        <w:t xml:space="preserve">Управління</w:t>
-      </w:r>
+        <w:t xml:space="preserve">Музика</w:t>
+      </w:r>
+    </w:p>
+    <w:p>
+      <w:pPr>
+        <w:spacing w:after="140" w:line="300"/>
+      </w:pPr>
+      <w:r>
+        <w:rPr>
+          <w:rFonts w:ascii="Arial" w:cs="Arial" w:eastAsia="Arial" w:hAnsi="Arial"/>
+          <w:sz w:val="22"/>
+          <w:szCs w:val="22"/>
+        </w:rPr>
+        <w:t xml:space="preserve">Звук сторіс — одна музична доріжка на всі 7 слайдів, окремо від відео. Під час переходу між слайдами музика не переривається.</w:t>
+      </w:r>
+    </w:p>
+    <w:tbl>
+      <w:tblPr>
+        <w:tblW w:type="dxa" w:w="9026"/>
+        <w:tblBorders>
+          <w:top w:val="single" w:color="auto" w:sz="4"/>
+          <w:left w:val="single" w:color="auto" w:sz="4"/>
+          <w:bottom w:val="single" w:color="auto" w:sz="4"/>
+          <w:right w:val="single" w:color="auto" w:sz="4"/>
+          <w:insideH w:val="single" w:color="auto" w:sz="4"/>
+          <w:insideV w:val="single" w:color="auto" w:sz="4"/>
+        </w:tblBorders>
+      </w:tblPr>
+      <w:tblGrid>
+        <w:gridCol w:w="2600"/>
+        <w:gridCol w:w="4826"/>
+        <w:gridCol w:w="1600"/>
+      </w:tblGrid>
+      <w:tr>
+        <w:trPr>
+          <w:tblHeader/>
+        </w:trPr>
+        <w:tc>
+          <w:tcPr>
+            <w:tcW w:type="dxa" w:w="2600"/>
+            <w:tcBorders>
+              <w:top w:val="single" w:color="BBBBBB" w:sz="4"/>
+              <w:left w:val="single" w:color="BBBBBB" w:sz="4"/>
+              <w:bottom w:val="single" w:color="BBBBBB" w:sz="4"/>
+              <w:right w:val="single" w:color="BBBBBB" w:sz="4"/>
+            </w:tcBorders>
+            <w:shd w:fill="E8EEF4" w:val="clear"/>
+            <w:tcMar>
+              <w:top w:type="dxa" w:w="70"/>
+              <w:left w:type="dxa" w:w="110"/>
+              <w:bottom w:type="dxa" w:w="70"/>
+              <w:right w:type="dxa" w:w="110"/>
+            </w:tcMar>
+          </w:tcPr>
+          <w:p>
+            <w:r>
+              <w:rPr>
+                <w:rFonts w:ascii="Arial" w:cs="Arial" w:eastAsia="Arial" w:hAnsi="Arial"/>
+                <w:b/>
+                <w:bCs/>
+                <w:sz w:val="20"/>
+                <w:szCs w:val="20"/>
+              </w:rPr>
+              <w:t xml:space="preserve">Файл</w:t>
+            </w:r>
+          </w:p>
+        </w:tc>
+        <w:tc>
+          <w:tcPr>
+            <w:tcW w:type="dxa" w:w="4826"/>
+            <w:tcBorders>
+              <w:top w:val="single" w:color="BBBBBB" w:sz="4"/>
+              <w:left w:val="single" w:color="BBBBBB" w:sz="4"/>
+              <w:bottom w:val="single" w:color="BBBBBB" w:sz="4"/>
+              <w:right w:val="single" w:color="BBBBBB" w:sz="4"/>
+            </w:tcBorders>
+            <w:shd w:fill="E8EEF4" w:val="clear"/>
+            <w:tcMar>
+              <w:top w:type="dxa" w:w="70"/>
+              <w:left w:type="dxa" w:w="110"/>
+              <w:bottom w:type="dxa" w:w="70"/>
+              <w:right w:type="dxa" w:w="110"/>
+            </w:tcMar>
+          </w:tcPr>
+          <w:p>
+            <w:r>
+              <w:rPr>
+                <w:rFonts w:ascii="Arial" w:cs="Arial" w:eastAsia="Arial" w:hAnsi="Arial"/>
+                <w:b/>
+                <w:bCs/>
+                <w:sz w:val="20"/>
+                <w:szCs w:val="20"/>
+              </w:rPr>
+              <w:t xml:space="preserve">Формат</w:t>
+            </w:r>
+          </w:p>
+        </w:tc>
+        <w:tc>
+          <w:tcPr>
+            <w:tcW w:type="dxa" w:w="1600"/>
+            <w:tcBorders>
+              <w:top w:val="single" w:color="BBBBBB" w:sz="4"/>
+              <w:left w:val="single" w:color="BBBBBB" w:sz="4"/>
+              <w:bottom w:val="single" w:color="BBBBBB" w:sz="4"/>
+              <w:right w:val="single" w:color="BBBBBB" w:sz="4"/>
+            </w:tcBorders>
+            <w:shd w:fill="E8EEF4" w:val="clear"/>
+            <w:tcMar>
+              <w:top w:type="dxa" w:w="70"/>
+              <w:left w:type="dxa" w:w="110"/>
+              <w:bottom w:type="dxa" w:w="70"/>
+              <w:right w:type="dxa" w:w="110"/>
+            </w:tcMar>
+          </w:tcPr>
+          <w:p>
+            <w:r>
+              <w:rPr>
+                <w:rFonts w:ascii="Arial" w:cs="Arial" w:eastAsia="Arial" w:hAnsi="Arial"/>
+                <w:b/>
+                <w:bCs/>
+                <w:sz w:val="20"/>
+                <w:szCs w:val="20"/>
+              </w:rPr>
+              <w:t xml:space="preserve">Розмір</w:t>
+            </w:r>
+          </w:p>
+        </w:tc>
+      </w:tr>
+      <w:tr>
+        <w:trPr>
+          <w:tblHeader w:val="off"/>
+        </w:trPr>
+        <w:tc>
+          <w:tcPr>
+            <w:tcW w:type="dxa" w:w="2600"/>
+            <w:tcBorders>
+              <w:top w:val="single" w:color="BBBBBB" w:sz="4"/>
+              <w:left w:val="single" w:color="BBBBBB" w:sz="4"/>
+              <w:bottom w:val="single" w:color="BBBBBB" w:sz="4"/>
+              <w:right w:val="single" w:color="BBBBBB" w:sz="4"/>
+            </w:tcBorders>
+            <w:tcMar>
+              <w:top w:type="dxa" w:w="70"/>
+              <w:left w:type="dxa" w:w="110"/>
+              <w:bottom w:type="dxa" w:w="70"/>
+              <w:right w:type="dxa" w:w="110"/>
+            </w:tcMar>
+          </w:tcPr>
+          <w:p>
+            <w:r>
+              <w:rPr>
+                <w:rFonts w:ascii="Menlo" w:cs="Menlo" w:eastAsia="Menlo" w:hAnsi="Menlo"/>
+                <w:sz w:val="20"/>
+                <w:szCs w:val="20"/>
+                <w:shd w:fill="F0F0F0" w:val="clear"/>
+              </w:rPr>
+              <w:t xml:space="preserve">soundtrack.m4a</w:t>
+            </w:r>
+          </w:p>
+        </w:tc>
+        <w:tc>
+          <w:tcPr>
+            <w:tcW w:type="dxa" w:w="4826"/>
+            <w:tcBorders>
+              <w:top w:val="single" w:color="BBBBBB" w:sz="4"/>
+              <w:left w:val="single" w:color="BBBBBB" w:sz="4"/>
+              <w:bottom w:val="single" w:color="BBBBBB" w:sz="4"/>
+              <w:right w:val="single" w:color="BBBBBB" w:sz="4"/>
+            </w:tcBorders>
+            <w:tcMar>
+              <w:top w:type="dxa" w:w="70"/>
+              <w:left w:type="dxa" w:w="110"/>
+              <w:bottom w:type="dxa" w:w="70"/>
+              <w:right w:type="dxa" w:w="110"/>
+            </w:tcMar>
+          </w:tcPr>
+          <w:p>
+            <w:r>
+              <w:rPr>
+                <w:rFonts w:ascii="Arial" w:cs="Arial" w:eastAsia="Arial" w:hAnsi="Arial"/>
+                <w:sz w:val="20"/>
+                <w:szCs w:val="20"/>
+              </w:rPr>
+              <w:t xml:space="preserve">HE-AAC, 64 кбіт/с</w:t>
+            </w:r>
+          </w:p>
+        </w:tc>
+        <w:tc>
+          <w:tcPr>
+            <w:tcW w:type="dxa" w:w="1600"/>
+            <w:tcBorders>
+              <w:top w:val="single" w:color="BBBBBB" w:sz="4"/>
+              <w:left w:val="single" w:color="BBBBBB" w:sz="4"/>
+              <w:bottom w:val="single" w:color="BBBBBB" w:sz="4"/>
+              <w:right w:val="single" w:color="BBBBBB" w:sz="4"/>
+            </w:tcBorders>
+            <w:tcMar>
+              <w:top w:type="dxa" w:w="70"/>
+              <w:left w:type="dxa" w:w="110"/>
+              <w:bottom w:type="dxa" w:w="70"/>
+              <w:right w:type="dxa" w:w="110"/>
+            </w:tcMar>
+          </w:tcPr>
+          <w:p>
+            <w:r>
+              <w:rPr>
+                <w:rFonts w:ascii="Arial" w:cs="Arial" w:eastAsia="Arial" w:hAnsi="Arial"/>
+                <w:sz w:val="20"/>
+                <w:szCs w:val="20"/>
+              </w:rPr>
+              <w:t xml:space="preserve">1,04 МБ</w:t>
+            </w:r>
+          </w:p>
+        </w:tc>
+      </w:tr>
+      <w:tr>
+        <w:trPr>
+          <w:tblHeader w:val="off"/>
+        </w:trPr>
+        <w:tc>
+          <w:tcPr>
+            <w:tcW w:type="dxa" w:w="2600"/>
+            <w:tcBorders>
+              <w:top w:val="single" w:color="BBBBBB" w:sz="4"/>
+              <w:left w:val="single" w:color="BBBBBB" w:sz="4"/>
+              <w:bottom w:val="single" w:color="BBBBBB" w:sz="4"/>
+              <w:right w:val="single" w:color="BBBBBB" w:sz="4"/>
+            </w:tcBorders>
+            <w:tcMar>
+              <w:top w:type="dxa" w:w="70"/>
+              <w:left w:type="dxa" w:w="110"/>
+              <w:bottom w:type="dxa" w:w="70"/>
+              <w:right w:type="dxa" w:w="110"/>
+            </w:tcMar>
+          </w:tcPr>
+          <w:p>
+            <w:r>
+              <w:rPr>
+                <w:rFonts w:ascii="Menlo" w:cs="Menlo" w:eastAsia="Menlo" w:hAnsi="Menlo"/>
+                <w:sz w:val="20"/>
+                <w:szCs w:val="20"/>
+                <w:shd w:fill="F0F0F0" w:val="clear"/>
+              </w:rPr>
+              <w:t xml:space="preserve">soundtrack.webm</w:t>
+            </w:r>
+          </w:p>
+        </w:tc>
+        <w:tc>
+          <w:tcPr>
+            <w:tcW w:type="dxa" w:w="4826"/>
+            <w:tcBorders>
+              <w:top w:val="single" w:color="BBBBBB" w:sz="4"/>
+              <w:left w:val="single" w:color="BBBBBB" w:sz="4"/>
+              <w:bottom w:val="single" w:color="BBBBBB" w:sz="4"/>
+              <w:right w:val="single" w:color="BBBBBB" w:sz="4"/>
+            </w:tcBorders>
+            <w:tcMar>
+              <w:top w:type="dxa" w:w="70"/>
+              <w:left w:type="dxa" w:w="110"/>
+              <w:bottom w:type="dxa" w:w="70"/>
+              <w:right w:type="dxa" w:w="110"/>
+            </w:tcMar>
+          </w:tcPr>
+          <w:p>
+            <w:r>
+              <w:rPr>
+                <w:rFonts w:ascii="Arial" w:cs="Arial" w:eastAsia="Arial" w:hAnsi="Arial"/>
+                <w:sz w:val="20"/>
+                <w:szCs w:val="20"/>
+              </w:rPr>
+              <w:t xml:space="preserve">Opus, 64 кбіт/с, для браузерів без AAC</w:t>
+            </w:r>
+          </w:p>
+        </w:tc>
+        <w:tc>
+          <w:tcPr>
+            <w:tcW w:type="dxa" w:w="1600"/>
+            <w:tcBorders>
+              <w:top w:val="single" w:color="BBBBBB" w:sz="4"/>
+              <w:left w:val="single" w:color="BBBBBB" w:sz="4"/>
+              <w:bottom w:val="single" w:color="BBBBBB" w:sz="4"/>
+              <w:right w:val="single" w:color="BBBBBB" w:sz="4"/>
+            </w:tcBorders>
+            <w:tcMar>
+              <w:top w:type="dxa" w:w="70"/>
+              <w:left w:type="dxa" w:w="110"/>
+              <w:bottom w:type="dxa" w:w="70"/>
+              <w:right w:type="dxa" w:w="110"/>
+            </w:tcMar>
+          </w:tcPr>
+          <w:p>
+            <w:r>
+              <w:rPr>
+                <w:rFonts w:ascii="Arial" w:cs="Arial" w:eastAsia="Arial" w:hAnsi="Arial"/>
+                <w:sz w:val="20"/>
+                <w:szCs w:val="20"/>
+              </w:rPr>
+              <w:t xml:space="preserve">1,08 МБ</w:t>
+            </w:r>
+          </w:p>
+        </w:tc>
+      </w:tr>
+    </w:tbl>
+    <w:p>
+      <w:pPr>
+        <w:spacing w:after="120"/>
+      </w:pPr>
     </w:p>
     <w:p>
       <w:pPr>
@@ -6833,20 +7127,10 @@
       <w:r>
         <w:rPr>
           <w:rFonts w:ascii="Arial" w:cs="Arial" w:eastAsia="Arial" w:hAnsi="Arial"/>
-          <w:b/>
-          <w:bCs/>
-          <w:sz w:val="22"/>
-          <w:szCs w:val="22"/>
-        </w:rPr>
-        <w:t xml:space="preserve">Мобільні пристрої</w:t>
-      </w:r>
-      <w:r>
-        <w:rPr>
-          <w:rFonts w:ascii="Arial" w:cs="Arial" w:eastAsia="Arial" w:hAnsi="Arial"/>
-          <w:sz w:val="22"/>
-          <w:szCs w:val="22"/>
-        </w:rPr>
-        <w:t xml:space="preserve">: тап у правій або лівій половині екрана — наступний або попередній слайд; утримання — пауза.</w:t>
+          <w:sz w:val="22"/>
+          <w:szCs w:val="22"/>
+        </w:rPr>
+        <w:t xml:space="preserve">Музика завантажується заздалегідь, у фоні, у перші секунди показу, тож звук вмикається одразу. Якщо звук увімкнули, поки музика ще завантажується, сторіс чекає її, коли вона встигає завантажитися за 1,5 секунди, інакше вмикає музику з мережі. Браузер завантажує один файл із двох — той, який підтримує.</w:t>
       </w:r>
     </w:p>
     <w:p>
@@ -6861,20 +7145,10 @@
       <w:r>
         <w:rPr>
           <w:rFonts w:ascii="Arial" w:cs="Arial" w:eastAsia="Arial" w:hAnsi="Arial"/>
-          <w:b/>
-          <w:bCs/>
-          <w:sz w:val="22"/>
-          <w:szCs w:val="22"/>
-        </w:rPr>
-        <w:t xml:space="preserve">Десктоп</w:t>
-      </w:r>
-      <w:r>
-        <w:rPr>
-          <w:rFonts w:ascii="Arial" w:cs="Arial" w:eastAsia="Arial" w:hAnsi="Arial"/>
-          <w:sz w:val="22"/>
-          <w:szCs w:val="22"/>
-        </w:rPr>
-        <w:t xml:space="preserve">: кнопки-стрілки, кнопка паузи.</w:t>
+          <w:sz w:val="22"/>
+          <w:szCs w:val="22"/>
+        </w:rPr>
+        <w:t xml:space="preserve">Музика йде поруч із відео з розбіжністю до 2 секунд і не прискорюється й не сповільнюється. Поки наступне відео завантажується, музика грає далі. Якщо розбіжність стає більшою, а також після тапу чи стрілки музика переходить на потрібне місце на ціле число тактів, тож ритм не збивається.</w:t>
       </w:r>
     </w:p>
     <w:p>
@@ -6889,31 +7163,10 @@
       <w:r>
         <w:rPr>
           <w:rFonts w:ascii="Arial" w:cs="Arial" w:eastAsia="Arial" w:hAnsi="Arial"/>
-          <w:b/>
-          <w:bCs/>
-          <w:sz w:val="22"/>
-          <w:szCs w:val="22"/>
-        </w:rPr>
-        <w:t xml:space="preserve">Звук</w:t>
-      </w:r>
-      <w:r>
-        <w:rPr>
-          <w:rFonts w:ascii="Arial" w:cs="Arial" w:eastAsia="Arial" w:hAnsi="Arial"/>
-          <w:sz w:val="22"/>
-          <w:szCs w:val="22"/>
-        </w:rPr>
-        <w:t xml:space="preserve">: кнопка в шапці сторіс; за замовчуванням звук вимкнено.</w:t>
-      </w:r>
-    </w:p>
-    <w:p>
-      <w:pPr>
-        <w:pStyle w:val="Heading2"/>
-      </w:pPr>
-      <w:r>
-        <w:rPr>
-          <w:rFonts w:ascii="Arial" w:cs="Arial" w:eastAsia="Arial" w:hAnsi="Arial"/>
-        </w:rPr>
-        <w:t xml:space="preserve">Адаптивність</w:t>
+          <w:sz w:val="22"/>
+          <w:szCs w:val="22"/>
+        </w:rPr>
+        <w:t xml:space="preserve">Пауза, утримання екрана, вимкнення звуку й закриття сторіс зупиняють музику. На прихованій вкладці музика не грає.</w:t>
       </w:r>
     </w:p>
     <w:p>
@@ -6931,7 +7184,63 @@
           <w:sz w:val="22"/>
           <w:szCs w:val="22"/>
         </w:rPr>
-        <w:t xml:space="preserve">Екран зі співвідношенням сторін 9:16 і десктоп: кадр відповідає макету.</w:t>
+        <w:t xml:space="preserve">Події </w:t>
+      </w:r>
+      <w:r>
+        <w:rPr>
+          <w:rFonts w:ascii="Menlo" w:cs="Menlo" w:eastAsia="Menlo" w:hAnsi="Menlo"/>
+          <w:sz w:val="22"/>
+          <w:szCs w:val="22"/>
+          <w:shd w:fill="F0F0F0" w:val="clear"/>
+        </w:rPr>
+        <w:t xml:space="preserve">mute_video</w:t>
+      </w:r>
+      <w:r>
+        <w:rPr>
+          <w:rFonts w:ascii="Arial" w:cs="Arial" w:eastAsia="Arial" w:hAnsi="Arial"/>
+          <w:sz w:val="22"/>
+          <w:szCs w:val="22"/>
+        </w:rPr>
+        <w:t xml:space="preserve"> і </w:t>
+      </w:r>
+      <w:r>
+        <w:rPr>
+          <w:rFonts w:ascii="Menlo" w:cs="Menlo" w:eastAsia="Menlo" w:hAnsi="Menlo"/>
+          <w:sz w:val="22"/>
+          <w:szCs w:val="22"/>
+          <w:shd w:fill="F0F0F0" w:val="clear"/>
+        </w:rPr>
+        <w:t xml:space="preserve">unmute_video</w:t>
+      </w:r>
+      <w:r>
+        <w:rPr>
+          <w:rFonts w:ascii="Arial" w:cs="Arial" w:eastAsia="Arial" w:hAnsi="Arial"/>
+          <w:sz w:val="22"/>
+          <w:szCs w:val="22"/>
+        </w:rPr>
+        <w:t xml:space="preserve"> надсилаються, як і раніше.</w:t>
+      </w:r>
+    </w:p>
+    <w:p>
+      <w:pPr>
+        <w:pStyle w:val="Heading1"/>
+      </w:pPr>
+      <w:r>
+        <w:rPr>
+          <w:rFonts w:ascii="Arial" w:cs="Arial" w:eastAsia="Arial" w:hAnsi="Arial"/>
+        </w:rPr>
+        <w:t xml:space="preserve">Технічні деталі</w:t>
+      </w:r>
+    </w:p>
+    <w:p>
+      <w:pPr>
+        <w:pStyle w:val="Heading2"/>
+      </w:pPr>
+      <w:r>
+        <w:rPr>
+          <w:rFonts w:ascii="Arial" w:cs="Arial" w:eastAsia="Arial" w:hAnsi="Arial"/>
+        </w:rPr>
+        <w:t xml:space="preserve">Управління</w:t>
       </w:r>
     </w:p>
     <w:p>
@@ -6946,10 +7255,20 @@
       <w:r>
         <w:rPr>
           <w:rFonts w:ascii="Arial" w:cs="Arial" w:eastAsia="Arial" w:hAnsi="Arial"/>
-          <w:sz w:val="22"/>
-          <w:szCs w:val="22"/>
-        </w:rPr>
-        <w:t xml:space="preserve">Екран, вищий за 9:16: відео займає всю ширину і притиснуте до нижнього краю, над ним — фон кольору верхнього краю відео; боки відео не обрізаються.</w:t>
+          <w:b/>
+          <w:bCs/>
+          <w:sz w:val="22"/>
+          <w:szCs w:val="22"/>
+        </w:rPr>
+        <w:t xml:space="preserve">Мобільні пристрої</w:t>
+      </w:r>
+      <w:r>
+        <w:rPr>
+          <w:rFonts w:ascii="Arial" w:cs="Arial" w:eastAsia="Arial" w:hAnsi="Arial"/>
+          <w:sz w:val="22"/>
+          <w:szCs w:val="22"/>
+        </w:rPr>
+        <w:t xml:space="preserve">: тап у правій або лівій половині екрана — наступний або попередній слайд; утримання — пауза.</w:t>
       </w:r>
     </w:p>
     <w:p>
@@ -6964,10 +7283,20 @@
       <w:r>
         <w:rPr>
           <w:rFonts w:ascii="Arial" w:cs="Arial" w:eastAsia="Arial" w:hAnsi="Arial"/>
-          <w:sz w:val="22"/>
-          <w:szCs w:val="22"/>
-        </w:rPr>
-        <w:t xml:space="preserve">Екран, нижчий за 9:16: відео займає всю ширину, зверху і знизу обрізається порівну.</w:t>
+          <w:b/>
+          <w:bCs/>
+          <w:sz w:val="22"/>
+          <w:szCs w:val="22"/>
+        </w:rPr>
+        <w:t xml:space="preserve">Десктоп</w:t>
+      </w:r>
+      <w:r>
+        <w:rPr>
+          <w:rFonts w:ascii="Arial" w:cs="Arial" w:eastAsia="Arial" w:hAnsi="Arial"/>
+          <w:sz w:val="22"/>
+          <w:szCs w:val="22"/>
+        </w:rPr>
+        <w:t xml:space="preserve">: кнопки-стрілки, кнопка паузи.</w:t>
       </w:r>
     </w:p>
     <w:p>
@@ -6982,98 +7311,31 @@
       <w:r>
         <w:rPr>
           <w:rFonts w:ascii="Arial" w:cs="Arial" w:eastAsia="Arial" w:hAnsi="Arial"/>
-          <w:sz w:val="22"/>
-          <w:szCs w:val="22"/>
-        </w:rPr>
-        <w:t xml:space="preserve">У горизонтальній орієнтації на мобільному пристрої показується прохання повернути телефон, відтворення ставиться на паузу.</w:t>
-      </w:r>
-    </w:p>
-    <w:p>
-      <w:pPr>
-        <w:pStyle w:val="Heading1"/>
-      </w:pPr>
-      <w:r>
-        <w:rPr>
-          <w:rFonts w:ascii="Arial" w:cs="Arial" w:eastAsia="Arial" w:hAnsi="Arial"/>
-        </w:rPr>
-        <w:t xml:space="preserve">Розміщення на CDN</w:t>
-      </w:r>
-    </w:p>
-    <w:p>
-      <w:pPr>
-        <w:spacing w:after="140" w:line="300"/>
-      </w:pPr>
-      <w:r>
-        <w:rPr>
-          <w:rFonts w:ascii="Arial" w:cs="Arial" w:eastAsia="Arial" w:hAnsi="Arial"/>
-          <w:sz w:val="22"/>
-          <w:szCs w:val="22"/>
-        </w:rPr>
-        <w:t xml:space="preserve">На CDN розміщується вміст папки </w:t>
-      </w:r>
-      <w:r>
-        <w:rPr>
-          <w:rFonts w:ascii="Menlo" w:cs="Menlo" w:eastAsia="Menlo" w:hAnsi="Menlo"/>
-          <w:sz w:val="22"/>
-          <w:szCs w:val="22"/>
-          <w:shd w:fill="F0F0F0" w:val="clear"/>
-        </w:rPr>
-        <w:t xml:space="preserve">dist/poker/</w:t>
-      </w:r>
-      <w:r>
-        <w:rPr>
-          <w:rFonts w:ascii="Arial" w:cs="Arial" w:eastAsia="Arial" w:hAnsi="Arial"/>
-          <w:sz w:val="22"/>
-          <w:szCs w:val="22"/>
-        </w:rPr>
-        <w:t xml:space="preserve"> без змін: </w:t>
-      </w:r>
-      <w:r>
-        <w:rPr>
-          <w:rFonts w:ascii="Menlo" w:cs="Menlo" w:eastAsia="Menlo" w:hAnsi="Menlo"/>
-          <w:sz w:val="22"/>
-          <w:szCs w:val="22"/>
-          <w:shd w:fill="F0F0F0" w:val="clear"/>
-        </w:rPr>
-        <w:t xml:space="preserve">index.html</w:t>
-      </w:r>
-      <w:r>
-        <w:rPr>
-          <w:rFonts w:ascii="Arial" w:cs="Arial" w:eastAsia="Arial" w:hAnsi="Arial"/>
-          <w:sz w:val="22"/>
-          <w:szCs w:val="22"/>
-        </w:rPr>
-        <w:t xml:space="preserve"> і папка </w:t>
-      </w:r>
-      <w:r>
-        <w:rPr>
-          <w:rFonts w:ascii="Menlo" w:cs="Menlo" w:eastAsia="Menlo" w:hAnsi="Menlo"/>
-          <w:sz w:val="22"/>
-          <w:szCs w:val="22"/>
-          <w:shd w:fill="F0F0F0" w:val="clear"/>
-        </w:rPr>
-        <w:t xml:space="preserve">assets/</w:t>
-      </w:r>
-      <w:r>
-        <w:rPr>
-          <w:rFonts w:ascii="Arial" w:cs="Arial" w:eastAsia="Arial" w:hAnsi="Arial"/>
-          <w:sz w:val="22"/>
-          <w:szCs w:val="22"/>
-        </w:rPr>
-        <w:t xml:space="preserve"> з 56 відеофайлами (7 слайдів × 2 розміри × 4 формати), скриптом і стилями.</w:t>
-      </w:r>
-    </w:p>
-    <w:p>
-      <w:pPr>
-        <w:spacing w:after="140" w:line="300"/>
-      </w:pPr>
-      <w:r>
-        <w:rPr>
-          <w:rFonts w:ascii="Arial" w:cs="Arial" w:eastAsia="Arial" w:hAnsi="Arial"/>
-          <w:sz w:val="22"/>
-          <w:szCs w:val="22"/>
-        </w:rPr>
-        <w:t xml:space="preserve">Вимоги до роздачі файлів:</w:t>
+          <w:b/>
+          <w:bCs/>
+          <w:sz w:val="22"/>
+          <w:szCs w:val="22"/>
+        </w:rPr>
+        <w:t xml:space="preserve">Звук</w:t>
+      </w:r>
+      <w:r>
+        <w:rPr>
+          <w:rFonts w:ascii="Arial" w:cs="Arial" w:eastAsia="Arial" w:hAnsi="Arial"/>
+          <w:sz w:val="22"/>
+          <w:szCs w:val="22"/>
+        </w:rPr>
+        <w:t xml:space="preserve">: кнопка в шапці сторіс; за замовчуванням звук вимкнено; музика не переривається між слайдами.</w:t>
+      </w:r>
+    </w:p>
+    <w:p>
+      <w:pPr>
+        <w:pStyle w:val="Heading2"/>
+      </w:pPr>
+      <w:r>
+        <w:rPr>
+          <w:rFonts w:ascii="Arial" w:cs="Arial" w:eastAsia="Arial" w:hAnsi="Arial"/>
+        </w:rPr>
+        <w:t xml:space="preserve">Адаптивність</w:t>
       </w:r>
     </w:p>
     <w:p>
@@ -7087,71 +7349,11 @@
       </w:pPr>
       <w:r>
         <w:rPr>
-          <w:rFonts w:ascii="Menlo" w:cs="Menlo" w:eastAsia="Menlo" w:hAnsi="Menlo"/>
-          <w:sz w:val="22"/>
-          <w:szCs w:val="22"/>
-          <w:shd w:fill="F0F0F0" w:val="clear"/>
-        </w:rPr>
-        <w:t xml:space="preserve">Content-Type: video/mp4</w:t>
-      </w:r>
-      <w:r>
-        <w:rPr>
-          <w:rFonts w:ascii="Arial" w:cs="Arial" w:eastAsia="Arial" w:hAnsi="Arial"/>
-          <w:sz w:val="22"/>
-          <w:szCs w:val="22"/>
-        </w:rPr>
-        <w:t xml:space="preserve"> для файлів </w:t>
-      </w:r>
-      <w:r>
-        <w:rPr>
-          <w:rFonts w:ascii="Menlo" w:cs="Menlo" w:eastAsia="Menlo" w:hAnsi="Menlo"/>
-          <w:sz w:val="22"/>
-          <w:szCs w:val="22"/>
-          <w:shd w:fill="F0F0F0" w:val="clear"/>
-        </w:rPr>
-        <w:t xml:space="preserve">.mp4</w:t>
-      </w:r>
-      <w:r>
-        <w:rPr>
-          <w:rFonts w:ascii="Arial" w:cs="Arial" w:eastAsia="Arial" w:hAnsi="Arial"/>
-          <w:sz w:val="22"/>
-          <w:szCs w:val="22"/>
-        </w:rPr>
-        <w:t xml:space="preserve"> і </w:t>
-      </w:r>
-      <w:r>
-        <w:rPr>
-          <w:rFonts w:ascii="Menlo" w:cs="Menlo" w:eastAsia="Menlo" w:hAnsi="Menlo"/>
-          <w:sz w:val="22"/>
-          <w:szCs w:val="22"/>
-          <w:shd w:fill="F0F0F0" w:val="clear"/>
-        </w:rPr>
-        <w:t xml:space="preserve">video/webm</w:t>
-      </w:r>
-      <w:r>
-        <w:rPr>
-          <w:rFonts w:ascii="Arial" w:cs="Arial" w:eastAsia="Arial" w:hAnsi="Arial"/>
-          <w:sz w:val="22"/>
-          <w:szCs w:val="22"/>
-        </w:rPr>
-        <w:t xml:space="preserve"> для файлів </w:t>
-      </w:r>
-      <w:r>
-        <w:rPr>
-          <w:rFonts w:ascii="Menlo" w:cs="Menlo" w:eastAsia="Menlo" w:hAnsi="Menlo"/>
-          <w:sz w:val="22"/>
-          <w:szCs w:val="22"/>
-          <w:shd w:fill="F0F0F0" w:val="clear"/>
-        </w:rPr>
-        <w:t xml:space="preserve">.webm</w:t>
-      </w:r>
-      <w:r>
-        <w:rPr>
-          <w:rFonts w:ascii="Arial" w:cs="Arial" w:eastAsia="Arial" w:hAnsi="Arial"/>
-          <w:sz w:val="22"/>
-          <w:szCs w:val="22"/>
-        </w:rPr>
-        <w:t xml:space="preserve">;</w:t>
+          <w:rFonts w:ascii="Arial" w:cs="Arial" w:eastAsia="Arial" w:hAnsi="Arial"/>
+          <w:sz w:val="22"/>
+          <w:szCs w:val="22"/>
+        </w:rPr>
+        <w:t xml:space="preserve">Екран зі співвідношенням сторін 9:16 і десктоп: кадр відповідає макету.</w:t>
       </w:r>
     </w:p>
     <w:p>
@@ -7169,337 +7371,7 @@
           <w:sz w:val="22"/>
           <w:szCs w:val="22"/>
         </w:rPr>
-        <w:t xml:space="preserve">підтримка часткових запитів (</w:t>
-      </w:r>
-      <w:r>
-        <w:rPr>
-          <w:rFonts w:ascii="Menlo" w:cs="Menlo" w:eastAsia="Menlo" w:hAnsi="Menlo"/>
-          <w:sz w:val="22"/>
-          <w:szCs w:val="22"/>
-          <w:shd w:fill="F0F0F0" w:val="clear"/>
-        </w:rPr>
-        <w:t xml:space="preserve">Accept-Ranges: bytes</w:t>
-      </w:r>
-      <w:r>
-        <w:rPr>
-          <w:rFonts w:ascii="Arial" w:cs="Arial" w:eastAsia="Arial" w:hAnsi="Arial"/>
-          <w:sz w:val="22"/>
-          <w:szCs w:val="22"/>
-        </w:rPr>
-        <w:t xml:space="preserve">).</w:t>
-      </w:r>
-    </w:p>
-    <w:p>
-      <w:pPr>
-        <w:pStyle w:val="Heading1"/>
-      </w:pPr>
-      <w:r>
-        <w:rPr>
-          <w:rFonts w:ascii="Arial" w:cs="Arial" w:eastAsia="Arial" w:hAnsi="Arial"/>
-        </w:rPr>
-        <w:t xml:space="preserve">Збірка</w:t>
-      </w:r>
-    </w:p>
-    <w:p>
-      <w:pPr>
-        <w:spacing w:after="140" w:line="300"/>
-      </w:pPr>
-      <w:r>
-        <w:rPr>
-          <w:rFonts w:ascii="Arial" w:cs="Arial" w:eastAsia="Arial" w:hAnsi="Arial"/>
-          <w:sz w:val="22"/>
-          <w:szCs w:val="22"/>
-        </w:rPr>
-        <w:t xml:space="preserve">Усі файли сторіс лежать у папці </w:t>
-      </w:r>
-      <w:r>
-        <w:rPr>
-          <w:rFonts w:ascii="Menlo" w:cs="Menlo" w:eastAsia="Menlo" w:hAnsi="Menlo"/>
-          <w:sz w:val="22"/>
-          <w:szCs w:val="22"/>
-          <w:shd w:fill="F0F0F0" w:val="clear"/>
-        </w:rPr>
-        <w:t xml:space="preserve">stories/poker/</w:t>
-      </w:r>
-      <w:r>
-        <w:rPr>
-          <w:rFonts w:ascii="Arial" w:cs="Arial" w:eastAsia="Arial" w:hAnsi="Arial"/>
-          <w:sz w:val="22"/>
-          <w:szCs w:val="22"/>
-        </w:rPr>
-        <w:t xml:space="preserve">: тексти (</w:t>
-      </w:r>
-      <w:r>
-        <w:rPr>
-          <w:rFonts w:ascii="Menlo" w:cs="Menlo" w:eastAsia="Menlo" w:hAnsi="Menlo"/>
-          <w:sz w:val="22"/>
-          <w:szCs w:val="22"/>
-          <w:shd w:fill="F0F0F0" w:val="clear"/>
-        </w:rPr>
-        <w:t xml:space="preserve">stories.json</w:t>
-      </w:r>
-      <w:r>
-        <w:rPr>
-          <w:rFonts w:ascii="Arial" w:cs="Arial" w:eastAsia="Arial" w:hAnsi="Arial"/>
-          <w:sz w:val="22"/>
-          <w:szCs w:val="22"/>
-        </w:rPr>
-        <w:t xml:space="preserve">), кольори та розміри шрифту (</w:t>
-      </w:r>
-      <w:r>
-        <w:rPr>
-          <w:rFonts w:ascii="Menlo" w:cs="Menlo" w:eastAsia="Menlo" w:hAnsi="Menlo"/>
-          <w:sz w:val="22"/>
-          <w:szCs w:val="22"/>
-          <w:shd w:fill="F0F0F0" w:val="clear"/>
-        </w:rPr>
-        <w:t xml:space="preserve">story.scss</w:t>
-      </w:r>
-      <w:r>
-        <w:rPr>
-          <w:rFonts w:ascii="Arial" w:cs="Arial" w:eastAsia="Arial" w:hAnsi="Arial"/>
-          <w:sz w:val="22"/>
-          <w:szCs w:val="22"/>
-        </w:rPr>
-        <w:t xml:space="preserve">), іконка, відео і звіт про відео. Код сторіс спільний для всіх сторіс проєкту.</w:t>
-      </w:r>
-    </w:p>
-    <w:p>
-      <w:pPr>
-        <w:shd w:fill="F4F4F4" w:val="clear"/>
-        <w:spacing w:after="0" w:before="80" w:line="260"/>
-        <w:ind w:left="140"/>
-      </w:pPr>
-      <w:r>
-        <w:rPr>
-          <w:rFonts w:ascii="Menlo" w:cs="Menlo" w:eastAsia="Menlo" w:hAnsi="Menlo"/>
-          <w:sz w:val="17"/>
-          <w:szCs w:val="17"/>
-        </w:rPr>
-        <w:t xml:space="preserve"># Встановлення залежностей</w:t>
-      </w:r>
-    </w:p>
-    <w:p>
-      <w:pPr>
-        <w:shd w:fill="F4F4F4" w:val="clear"/>
-        <w:spacing w:after="0" w:before="0" w:line="260"/>
-        <w:ind w:left="140"/>
-      </w:pPr>
-      <w:r>
-        <w:rPr>
-          <w:rFonts w:ascii="Menlo" w:cs="Menlo" w:eastAsia="Menlo" w:hAnsi="Menlo"/>
-          <w:sz w:val="17"/>
-          <w:szCs w:val="17"/>
-        </w:rPr>
-        <w:t xml:space="preserve">npm install</w:t>
-      </w:r>
-    </w:p>
-    <w:p>
-      <w:pPr>
-        <w:shd w:fill="F4F4F4" w:val="clear"/>
-        <w:spacing w:after="0" w:before="0" w:line="260"/>
-        <w:ind w:left="140"/>
-      </w:pPr>
-      <w:r>
-        <w:rPr>
-          <w:rFonts w:ascii="Menlo" w:cs="Menlo" w:eastAsia="Menlo" w:hAnsi="Menlo"/>
-          <w:sz w:val="17"/>
-          <w:szCs w:val="17"/>
-        </w:rPr>
-        <w:t xml:space="preserve"> </w:t>
-      </w:r>
-    </w:p>
-    <w:p>
-      <w:pPr>
-        <w:shd w:fill="F4F4F4" w:val="clear"/>
-        <w:spacing w:after="0" w:before="0" w:line="260"/>
-        <w:ind w:left="140"/>
-      </w:pPr>
-      <w:r>
-        <w:rPr>
-          <w:rFonts w:ascii="Menlo" w:cs="Menlo" w:eastAsia="Menlo" w:hAnsi="Menlo"/>
-          <w:sz w:val="17"/>
-          <w:szCs w:val="17"/>
-        </w:rPr>
-        <w:t xml:space="preserve"># Режим розробки</w:t>
-      </w:r>
-    </w:p>
-    <w:p>
-      <w:pPr>
-        <w:shd w:fill="F4F4F4" w:val="clear"/>
-        <w:spacing w:after="0" w:before="0" w:line="260"/>
-        <w:ind w:left="140"/>
-      </w:pPr>
-      <w:r>
-        <w:rPr>
-          <w:rFonts w:ascii="Menlo" w:cs="Menlo" w:eastAsia="Menlo" w:hAnsi="Menlo"/>
-          <w:sz w:val="17"/>
-          <w:szCs w:val="17"/>
-        </w:rPr>
-        <w:t xml:space="preserve">npm run dev poker</w:t>
-      </w:r>
-    </w:p>
-    <w:p>
-      <w:pPr>
-        <w:shd w:fill="F4F4F4" w:val="clear"/>
-        <w:spacing w:after="0" w:before="0" w:line="260"/>
-        <w:ind w:left="140"/>
-      </w:pPr>
-      <w:r>
-        <w:rPr>
-          <w:rFonts w:ascii="Menlo" w:cs="Menlo" w:eastAsia="Menlo" w:hAnsi="Menlo"/>
-          <w:sz w:val="17"/>
-          <w:szCs w:val="17"/>
-        </w:rPr>
-        <w:t xml:space="preserve"> </w:t>
-      </w:r>
-    </w:p>
-    <w:p>
-      <w:pPr>
-        <w:shd w:fill="F4F4F4" w:val="clear"/>
-        <w:spacing w:after="0" w:before="0" w:line="260"/>
-        <w:ind w:left="140"/>
-      </w:pPr>
-      <w:r>
-        <w:rPr>
-          <w:rFonts w:ascii="Menlo" w:cs="Menlo" w:eastAsia="Menlo" w:hAnsi="Menlo"/>
-          <w:sz w:val="17"/>
-          <w:szCs w:val="17"/>
-        </w:rPr>
-        <w:t xml:space="preserve"># Збірка для продакшену — результат у dist/poker/</w:t>
-      </w:r>
-    </w:p>
-    <w:p>
-      <w:pPr>
-        <w:shd w:fill="F4F4F4" w:val="clear"/>
-        <w:spacing w:after="0" w:before="0" w:line="260"/>
-        <w:ind w:left="140"/>
-      </w:pPr>
-      <w:r>
-        <w:rPr>
-          <w:rFonts w:ascii="Menlo" w:cs="Menlo" w:eastAsia="Menlo" w:hAnsi="Menlo"/>
-          <w:sz w:val="17"/>
-          <w:szCs w:val="17"/>
-        </w:rPr>
-        <w:t xml:space="preserve">npm run build poker</w:t>
-      </w:r>
-    </w:p>
-    <w:p>
-      <w:pPr>
-        <w:shd w:fill="F4F4F4" w:val="clear"/>
-        <w:spacing w:after="0" w:before="0" w:line="260"/>
-        <w:ind w:left="140"/>
-      </w:pPr>
-      <w:r>
-        <w:rPr>
-          <w:rFonts w:ascii="Menlo" w:cs="Menlo" w:eastAsia="Menlo" w:hAnsi="Menlo"/>
-          <w:sz w:val="17"/>
-          <w:szCs w:val="17"/>
-        </w:rPr>
-        <w:t xml:space="preserve"> </w:t>
-      </w:r>
-    </w:p>
-    <w:p>
-      <w:pPr>
-        <w:shd w:fill="F4F4F4" w:val="clear"/>
-        <w:spacing w:after="0" w:before="0" w:line="260"/>
-        <w:ind w:left="140"/>
-      </w:pPr>
-      <w:r>
-        <w:rPr>
-          <w:rFonts w:ascii="Menlo" w:cs="Menlo" w:eastAsia="Menlo" w:hAnsi="Menlo"/>
-          <w:sz w:val="17"/>
-          <w:szCs w:val="17"/>
-        </w:rPr>
-        <w:t xml:space="preserve"># Попередній перегляд збірки</w:t>
-      </w:r>
-    </w:p>
-    <w:p>
-      <w:pPr>
-        <w:shd w:fill="F4F4F4" w:val="clear"/>
-        <w:spacing w:after="160" w:before="0" w:line="260"/>
-        <w:ind w:left="140"/>
-      </w:pPr>
-      <w:r>
-        <w:rPr>
-          <w:rFonts w:ascii="Menlo" w:cs="Menlo" w:eastAsia="Menlo" w:hAnsi="Menlo"/>
-          <w:sz w:val="17"/>
-          <w:szCs w:val="17"/>
-        </w:rPr>
-        <w:t xml:space="preserve">npm run preview poker</w:t>
-      </w:r>
-    </w:p>
-    <w:p>
-      <w:pPr>
-        <w:pStyle w:val="Heading1"/>
-      </w:pPr>
-      <w:r>
-        <w:rPr>
-          <w:rFonts w:ascii="Arial" w:cs="Arial" w:eastAsia="Arial" w:hAnsi="Arial"/>
-        </w:rPr>
-        <w:t xml:space="preserve">Підготовка відео</w:t>
-      </w:r>
-    </w:p>
-    <w:p>
-      <w:pPr>
-        <w:spacing w:after="140" w:line="300"/>
-      </w:pPr>
-      <w:r>
-        <w:rPr>
-          <w:rFonts w:ascii="Arial" w:cs="Arial" w:eastAsia="Arial" w:hAnsi="Arial"/>
-          <w:sz w:val="22"/>
-          <w:szCs w:val="22"/>
-        </w:rPr>
-        <w:t xml:space="preserve">Відеофайли вже лежать у репозиторії, у </w:t>
-      </w:r>
-      <w:r>
-        <w:rPr>
-          <w:rFonts w:ascii="Menlo" w:cs="Menlo" w:eastAsia="Menlo" w:hAnsi="Menlo"/>
-          <w:sz w:val="22"/>
-          <w:szCs w:val="22"/>
-          <w:shd w:fill="F0F0F0" w:val="clear"/>
-        </w:rPr>
-        <w:t xml:space="preserve">stories/poker/videos/</w:t>
-      </w:r>
-      <w:r>
-        <w:rPr>
-          <w:rFonts w:ascii="Arial" w:cs="Arial" w:eastAsia="Arial" w:hAnsi="Arial"/>
-          <w:sz w:val="22"/>
-          <w:szCs w:val="22"/>
-        </w:rPr>
-        <w:t xml:space="preserve">. Їх створює скрипт </w:t>
-      </w:r>
-      <w:r>
-        <w:rPr>
-          <w:rFonts w:ascii="Menlo" w:cs="Menlo" w:eastAsia="Menlo" w:hAnsi="Menlo"/>
-          <w:sz w:val="22"/>
-          <w:szCs w:val="22"/>
-          <w:shd w:fill="F0F0F0" w:val="clear"/>
-        </w:rPr>
-        <w:t xml:space="preserve">scripts/encode-story-videos.mjs</w:t>
-      </w:r>
-      <w:r>
-        <w:rPr>
-          <w:rFonts w:ascii="Arial" w:cs="Arial" w:eastAsia="Arial" w:hAnsi="Arial"/>
-          <w:sz w:val="22"/>
-          <w:szCs w:val="22"/>
-        </w:rPr>
-        <w:t xml:space="preserve"> з вихідних файлів дизайнера:</w:t>
-      </w:r>
-    </w:p>
-    <w:p>
-      <w:pPr>
-        <w:shd w:fill="F4F4F4" w:val="clear"/>
-        <w:spacing w:after="160" w:before="80" w:line="260"/>
-        <w:ind w:left="140"/>
-      </w:pPr>
-      <w:r>
-        <w:rPr>
-          <w:rFonts w:ascii="Menlo" w:cs="Menlo" w:eastAsia="Menlo" w:hAnsi="Menlo"/>
-          <w:sz w:val="17"/>
-          <w:szCs w:val="17"/>
-        </w:rPr>
-        <w:t xml:space="preserve">npm run video:encode -- --story poker --src &lt;папка з вихідними файлами&gt;</w:t>
+        <w:t xml:space="preserve">Екран, вищий за 9:16: відео займає всю ширину і притиснуте до нижнього краю, над ним — фон кольору верхнього краю відео; боки відео не обрізаються.</w:t>
       </w:r>
     </w:p>
     <w:p>
@@ -7517,58 +7389,7 @@
           <w:sz w:val="22"/>
           <w:szCs w:val="22"/>
         </w:rPr>
-        <w:t xml:space="preserve">Вихідні файли — по одному MP4 на слайд, 1080×1920, з назвою за номером слайда: </w:t>
-      </w:r>
-      <w:r>
-        <w:rPr>
-          <w:rFonts w:ascii="Menlo" w:cs="Menlo" w:eastAsia="Menlo" w:hAnsi="Menlo"/>
-          <w:sz w:val="22"/>
-          <w:szCs w:val="22"/>
-          <w:shd w:fill="F0F0F0" w:val="clear"/>
-        </w:rPr>
-        <w:t xml:space="preserve">1.mp4</w:t>
-      </w:r>
-      <w:r>
-        <w:rPr>
-          <w:rFonts w:ascii="Arial" w:cs="Arial" w:eastAsia="Arial" w:hAnsi="Arial"/>
-          <w:sz w:val="22"/>
-          <w:szCs w:val="22"/>
-        </w:rPr>
-        <w:t xml:space="preserve">, </w:t>
-      </w:r>
-      <w:r>
-        <w:rPr>
-          <w:rFonts w:ascii="Menlo" w:cs="Menlo" w:eastAsia="Menlo" w:hAnsi="Menlo"/>
-          <w:sz w:val="22"/>
-          <w:szCs w:val="22"/>
-          <w:shd w:fill="F0F0F0" w:val="clear"/>
-        </w:rPr>
-        <w:t xml:space="preserve">2.mp4</w:t>
-      </w:r>
-      <w:r>
-        <w:rPr>
-          <w:rFonts w:ascii="Arial" w:cs="Arial" w:eastAsia="Arial" w:hAnsi="Arial"/>
-          <w:sz w:val="22"/>
-          <w:szCs w:val="22"/>
-        </w:rPr>
-        <w:t xml:space="preserve">. Повторна версія називається </w:t>
-      </w:r>
-      <w:r>
-        <w:rPr>
-          <w:rFonts w:ascii="Menlo" w:cs="Menlo" w:eastAsia="Menlo" w:hAnsi="Menlo"/>
-          <w:sz w:val="22"/>
-          <w:szCs w:val="22"/>
-          <w:shd w:fill="F0F0F0" w:val="clear"/>
-        </w:rPr>
-        <w:t xml:space="preserve">2_1.mp4</w:t>
-      </w:r>
-      <w:r>
-        <w:rPr>
-          <w:rFonts w:ascii="Arial" w:cs="Arial" w:eastAsia="Arial" w:hAnsi="Arial"/>
-          <w:sz w:val="22"/>
-          <w:szCs w:val="22"/>
-        </w:rPr>
-        <w:t xml:space="preserve">; з кількох версій береться найновіша. Інші файли в папці пропускаються.</w:t>
+        <w:t xml:space="preserve">Екран, нижчий за 9:16: відео займає всю ширину, зверху і знизу обрізається порівну.</w:t>
       </w:r>
     </w:p>
     <w:p>
@@ -7586,7 +7407,95 @@
           <w:sz w:val="22"/>
           <w:szCs w:val="22"/>
         </w:rPr>
-        <w:t xml:space="preserve">Скрипт створює обидва розміри і всі чотири формати та підбирає стиснення окремо для кожного відео: найменший файл, якість якого не нижча за поріг. Відео обробляються по одному, щоб не перевантажувати комп'ютер.</w:t>
+        <w:t xml:space="preserve">У горизонтальній орієнтації на мобільному пристрої показується прохання повернути телефон, відтворення ставиться на паузу.</w:t>
+      </w:r>
+    </w:p>
+    <w:p>
+      <w:pPr>
+        <w:pStyle w:val="Heading1"/>
+      </w:pPr>
+      <w:r>
+        <w:rPr>
+          <w:rFonts w:ascii="Arial" w:cs="Arial" w:eastAsia="Arial" w:hAnsi="Arial"/>
+        </w:rPr>
+        <w:t xml:space="preserve">Розміщення на CDN</w:t>
+      </w:r>
+    </w:p>
+    <w:p>
+      <w:pPr>
+        <w:spacing w:after="140" w:line="300"/>
+      </w:pPr>
+      <w:r>
+        <w:rPr>
+          <w:rFonts w:ascii="Arial" w:cs="Arial" w:eastAsia="Arial" w:hAnsi="Arial"/>
+          <w:sz w:val="22"/>
+          <w:szCs w:val="22"/>
+        </w:rPr>
+        <w:t xml:space="preserve">На CDN розміщується вміст папки </w:t>
+      </w:r>
+      <w:r>
+        <w:rPr>
+          <w:rFonts w:ascii="Menlo" w:cs="Menlo" w:eastAsia="Menlo" w:hAnsi="Menlo"/>
+          <w:sz w:val="22"/>
+          <w:szCs w:val="22"/>
+          <w:shd w:fill="F0F0F0" w:val="clear"/>
+        </w:rPr>
+        <w:t xml:space="preserve">dist/poker/</w:t>
+      </w:r>
+      <w:r>
+        <w:rPr>
+          <w:rFonts w:ascii="Arial" w:cs="Arial" w:eastAsia="Arial" w:hAnsi="Arial"/>
+          <w:sz w:val="22"/>
+          <w:szCs w:val="22"/>
+        </w:rPr>
+        <w:t xml:space="preserve"> без змін: </w:t>
+      </w:r>
+      <w:r>
+        <w:rPr>
+          <w:rFonts w:ascii="Menlo" w:cs="Menlo" w:eastAsia="Menlo" w:hAnsi="Menlo"/>
+          <w:sz w:val="22"/>
+          <w:szCs w:val="22"/>
+          <w:shd w:fill="F0F0F0" w:val="clear"/>
+        </w:rPr>
+        <w:t xml:space="preserve">index.html</w:t>
+      </w:r>
+      <w:r>
+        <w:rPr>
+          <w:rFonts w:ascii="Arial" w:cs="Arial" w:eastAsia="Arial" w:hAnsi="Arial"/>
+          <w:sz w:val="22"/>
+          <w:szCs w:val="22"/>
+        </w:rPr>
+        <w:t xml:space="preserve"> і папка </w:t>
+      </w:r>
+      <w:r>
+        <w:rPr>
+          <w:rFonts w:ascii="Menlo" w:cs="Menlo" w:eastAsia="Menlo" w:hAnsi="Menlo"/>
+          <w:sz w:val="22"/>
+          <w:szCs w:val="22"/>
+          <w:shd w:fill="F0F0F0" w:val="clear"/>
+        </w:rPr>
+        <w:t xml:space="preserve">assets/</w:t>
+      </w:r>
+      <w:r>
+        <w:rPr>
+          <w:rFonts w:ascii="Arial" w:cs="Arial" w:eastAsia="Arial" w:hAnsi="Arial"/>
+          <w:sz w:val="22"/>
+          <w:szCs w:val="22"/>
+        </w:rPr>
+        <w:t xml:space="preserve"> з 56 відеофайлами (7 слайдів × 2 розміри × 4 формати), двома файлами музики, скриптом і стилями.</w:t>
+      </w:r>
+    </w:p>
+    <w:p>
+      <w:pPr>
+        <w:spacing w:after="140" w:line="300"/>
+      </w:pPr>
+      <w:r>
+        <w:rPr>
+          <w:rFonts w:ascii="Arial" w:cs="Arial" w:eastAsia="Arial" w:hAnsi="Arial"/>
+          <w:sz w:val="22"/>
+          <w:szCs w:val="22"/>
+        </w:rPr>
+        <w:t xml:space="preserve">Вимоги до роздачі файлів:</w:t>
       </w:r>
     </w:p>
     <w:p>
@@ -7600,20 +7509,29 @@
       </w:pPr>
       <w:r>
         <w:rPr>
-          <w:rFonts w:ascii="Arial" w:cs="Arial" w:eastAsia="Arial" w:hAnsi="Arial"/>
-          <w:sz w:val="22"/>
-          <w:szCs w:val="22"/>
-        </w:rPr>
-        <w:t xml:space="preserve">Сторіс знаходить файли за назвою кліпу (</w:t>
-      </w:r>
-      <w:r>
-        <w:rPr>
           <w:rFonts w:ascii="Menlo" w:cs="Menlo" w:eastAsia="Menlo" w:hAnsi="Menlo"/>
           <w:sz w:val="22"/>
           <w:szCs w:val="22"/>
           <w:shd w:fill="F0F0F0" w:val="clear"/>
         </w:rPr>
-        <w:t xml:space="preserve">story_1</w:t>
+        <w:t xml:space="preserve">Content-Type: video/mp4</w:t>
+      </w:r>
+      <w:r>
+        <w:rPr>
+          <w:rFonts w:ascii="Arial" w:cs="Arial" w:eastAsia="Arial" w:hAnsi="Arial"/>
+          <w:sz w:val="22"/>
+          <w:szCs w:val="22"/>
+        </w:rPr>
+        <w:t xml:space="preserve"> для файлів </w:t>
+      </w:r>
+      <w:r>
+        <w:rPr>
+          <w:rFonts w:ascii="Menlo" w:cs="Menlo" w:eastAsia="Menlo" w:hAnsi="Menlo"/>
+          <w:sz w:val="22"/>
+          <w:szCs w:val="22"/>
+          <w:shd w:fill="F0F0F0" w:val="clear"/>
+        </w:rPr>
+        <w:t xml:space="preserve">.mp4</w:t>
       </w:r>
       <w:r>
         <w:rPr>
@@ -7630,15 +7548,15 @@
           <w:szCs w:val="22"/>
           <w:shd w:fill="F0F0F0" w:val="clear"/>
         </w:rPr>
-        <w:t xml:space="preserve">story_2</w:t>
-      </w:r>
-      <w:r>
-        <w:rPr>
-          <w:rFonts w:ascii="Arial" w:cs="Arial" w:eastAsia="Arial" w:hAnsi="Arial"/>
-          <w:sz w:val="22"/>
-          <w:szCs w:val="22"/>
-        </w:rPr>
-        <w:t xml:space="preserve">…), тому шляхи до відео в </w:t>
+        <w:t xml:space="preserve">video/webm</w:t>
+      </w:r>
+      <w:r>
+        <w:rPr>
+          <w:rFonts w:ascii="Arial" w:cs="Arial" w:eastAsia="Arial" w:hAnsi="Arial"/>
+          <w:sz w:val="22"/>
+          <w:szCs w:val="22"/>
+        </w:rPr>
+        <w:t xml:space="preserve"> для файлів </w:t>
       </w:r>
       <w:r>
         <w:rPr>
@@ -7647,15 +7565,49 @@
           <w:szCs w:val="22"/>
           <w:shd w:fill="F0F0F0" w:val="clear"/>
         </w:rPr>
-        <w:t xml:space="preserve">stories.json</w:t>
-      </w:r>
-      <w:r>
-        <w:rPr>
-          <w:rFonts w:ascii="Arial" w:cs="Arial" w:eastAsia="Arial" w:hAnsi="Arial"/>
-          <w:sz w:val="22"/>
-          <w:szCs w:val="22"/>
-        </w:rPr>
-        <w:t xml:space="preserve"> не прописуються.</w:t>
+        <w:t xml:space="preserve">.webm</w:t>
+      </w:r>
+      <w:r>
+        <w:rPr>
+          <w:rFonts w:ascii="Arial" w:cs="Arial" w:eastAsia="Arial" w:hAnsi="Arial"/>
+          <w:sz w:val="22"/>
+          <w:szCs w:val="22"/>
+        </w:rPr>
+        <w:t xml:space="preserve"> і </w:t>
+      </w:r>
+      <w:r>
+        <w:rPr>
+          <w:rFonts w:ascii="Menlo" w:cs="Menlo" w:eastAsia="Menlo" w:hAnsi="Menlo"/>
+          <w:sz w:val="22"/>
+          <w:szCs w:val="22"/>
+          <w:shd w:fill="F0F0F0" w:val="clear"/>
+        </w:rPr>
+        <w:t xml:space="preserve">audio/mp4</w:t>
+      </w:r>
+      <w:r>
+        <w:rPr>
+          <w:rFonts w:ascii="Arial" w:cs="Arial" w:eastAsia="Arial" w:hAnsi="Arial"/>
+          <w:sz w:val="22"/>
+          <w:szCs w:val="22"/>
+        </w:rPr>
+        <w:t xml:space="preserve"> для файлу </w:t>
+      </w:r>
+      <w:r>
+        <w:rPr>
+          <w:rFonts w:ascii="Menlo" w:cs="Menlo" w:eastAsia="Menlo" w:hAnsi="Menlo"/>
+          <w:sz w:val="22"/>
+          <w:szCs w:val="22"/>
+          <w:shd w:fill="F0F0F0" w:val="clear"/>
+        </w:rPr>
+        <w:t xml:space="preserve">.m4a</w:t>
+      </w:r>
+      <w:r>
+        <w:rPr>
+          <w:rFonts w:ascii="Arial" w:cs="Arial" w:eastAsia="Arial" w:hAnsi="Arial"/>
+          <w:sz w:val="22"/>
+          <w:szCs w:val="22"/>
+        </w:rPr>
+        <w:t xml:space="preserve">;</w:t>
       </w:r>
     </w:p>
     <w:p>
@@ -7673,7 +7625,7 @@
           <w:sz w:val="22"/>
           <w:szCs w:val="22"/>
         </w:rPr>
-        <w:t xml:space="preserve">Результати записуються у </w:t>
+        <w:t xml:space="preserve">підтримка часткових запитів (</w:t>
       </w:r>
       <w:r>
         <w:rPr>
@@ -7682,15 +7634,345 @@
           <w:szCs w:val="22"/>
           <w:shd w:fill="F0F0F0" w:val="clear"/>
         </w:rPr>
-        <w:t xml:space="preserve">stories/poker/video-report.json</w:t>
-      </w:r>
-      <w:r>
-        <w:rPr>
-          <w:rFonts w:ascii="Arial" w:cs="Arial" w:eastAsia="Arial" w:hAnsi="Arial"/>
-          <w:sz w:val="22"/>
-          <w:szCs w:val="22"/>
-        </w:rPr>
-        <w:t xml:space="preserve">: вага, оцінка якості, тип джерела кожного файлу.</w:t>
+        <w:t xml:space="preserve">Accept-Ranges: bytes</w:t>
+      </w:r>
+      <w:r>
+        <w:rPr>
+          <w:rFonts w:ascii="Arial" w:cs="Arial" w:eastAsia="Arial" w:hAnsi="Arial"/>
+          <w:sz w:val="22"/>
+          <w:szCs w:val="22"/>
+        </w:rPr>
+        <w:t xml:space="preserve">).</w:t>
+      </w:r>
+    </w:p>
+    <w:p>
+      <w:pPr>
+        <w:pStyle w:val="Heading1"/>
+      </w:pPr>
+      <w:r>
+        <w:rPr>
+          <w:rFonts w:ascii="Arial" w:cs="Arial" w:eastAsia="Arial" w:hAnsi="Arial"/>
+        </w:rPr>
+        <w:t xml:space="preserve">Збірка</w:t>
+      </w:r>
+    </w:p>
+    <w:p>
+      <w:pPr>
+        <w:spacing w:after="140" w:line="300"/>
+      </w:pPr>
+      <w:r>
+        <w:rPr>
+          <w:rFonts w:ascii="Arial" w:cs="Arial" w:eastAsia="Arial" w:hAnsi="Arial"/>
+          <w:sz w:val="22"/>
+          <w:szCs w:val="22"/>
+        </w:rPr>
+        <w:t xml:space="preserve">Усі файли сторіс лежать у папці </w:t>
+      </w:r>
+      <w:r>
+        <w:rPr>
+          <w:rFonts w:ascii="Menlo" w:cs="Menlo" w:eastAsia="Menlo" w:hAnsi="Menlo"/>
+          <w:sz w:val="22"/>
+          <w:szCs w:val="22"/>
+          <w:shd w:fill="F0F0F0" w:val="clear"/>
+        </w:rPr>
+        <w:t xml:space="preserve">stories/poker/</w:t>
+      </w:r>
+      <w:r>
+        <w:rPr>
+          <w:rFonts w:ascii="Arial" w:cs="Arial" w:eastAsia="Arial" w:hAnsi="Arial"/>
+          <w:sz w:val="22"/>
+          <w:szCs w:val="22"/>
+        </w:rPr>
+        <w:t xml:space="preserve">: тексти (</w:t>
+      </w:r>
+      <w:r>
+        <w:rPr>
+          <w:rFonts w:ascii="Menlo" w:cs="Menlo" w:eastAsia="Menlo" w:hAnsi="Menlo"/>
+          <w:sz w:val="22"/>
+          <w:szCs w:val="22"/>
+          <w:shd w:fill="F0F0F0" w:val="clear"/>
+        </w:rPr>
+        <w:t xml:space="preserve">stories.json</w:t>
+      </w:r>
+      <w:r>
+        <w:rPr>
+          <w:rFonts w:ascii="Arial" w:cs="Arial" w:eastAsia="Arial" w:hAnsi="Arial"/>
+          <w:sz w:val="22"/>
+          <w:szCs w:val="22"/>
+        </w:rPr>
+        <w:t xml:space="preserve">), кольори та розміри шрифту (</w:t>
+      </w:r>
+      <w:r>
+        <w:rPr>
+          <w:rFonts w:ascii="Menlo" w:cs="Menlo" w:eastAsia="Menlo" w:hAnsi="Menlo"/>
+          <w:sz w:val="22"/>
+          <w:szCs w:val="22"/>
+          <w:shd w:fill="F0F0F0" w:val="clear"/>
+        </w:rPr>
+        <w:t xml:space="preserve">story.scss</w:t>
+      </w:r>
+      <w:r>
+        <w:rPr>
+          <w:rFonts w:ascii="Arial" w:cs="Arial" w:eastAsia="Arial" w:hAnsi="Arial"/>
+          <w:sz w:val="22"/>
+          <w:szCs w:val="22"/>
+        </w:rPr>
+        <w:t xml:space="preserve">), іконка, відео, звіт про відео і музика (</w:t>
+      </w:r>
+      <w:r>
+        <w:rPr>
+          <w:rFonts w:ascii="Menlo" w:cs="Menlo" w:eastAsia="Menlo" w:hAnsi="Menlo"/>
+          <w:sz w:val="22"/>
+          <w:szCs w:val="22"/>
+          <w:shd w:fill="F0F0F0" w:val="clear"/>
+        </w:rPr>
+        <w:t xml:space="preserve">audio/</w:t>
+      </w:r>
+      <w:r>
+        <w:rPr>
+          <w:rFonts w:ascii="Arial" w:cs="Arial" w:eastAsia="Arial" w:hAnsi="Arial"/>
+          <w:sz w:val="22"/>
+          <w:szCs w:val="22"/>
+        </w:rPr>
+        <w:t xml:space="preserve">). Код сторіс спільний для всіх сторіс проєкту.</w:t>
+      </w:r>
+    </w:p>
+    <w:p>
+      <w:pPr>
+        <w:shd w:fill="F4F4F4" w:val="clear"/>
+        <w:spacing w:after="0" w:before="80" w:line="260"/>
+        <w:ind w:left="140"/>
+      </w:pPr>
+      <w:r>
+        <w:rPr>
+          <w:rFonts w:ascii="Menlo" w:cs="Menlo" w:eastAsia="Menlo" w:hAnsi="Menlo"/>
+          <w:sz w:val="17"/>
+          <w:szCs w:val="17"/>
+        </w:rPr>
+        <w:t xml:space="preserve"># Встановлення залежностей</w:t>
+      </w:r>
+    </w:p>
+    <w:p>
+      <w:pPr>
+        <w:shd w:fill="F4F4F4" w:val="clear"/>
+        <w:spacing w:after="0" w:before="0" w:line="260"/>
+        <w:ind w:left="140"/>
+      </w:pPr>
+      <w:r>
+        <w:rPr>
+          <w:rFonts w:ascii="Menlo" w:cs="Menlo" w:eastAsia="Menlo" w:hAnsi="Menlo"/>
+          <w:sz w:val="17"/>
+          <w:szCs w:val="17"/>
+        </w:rPr>
+        <w:t xml:space="preserve">npm install</w:t>
+      </w:r>
+    </w:p>
+    <w:p>
+      <w:pPr>
+        <w:shd w:fill="F4F4F4" w:val="clear"/>
+        <w:spacing w:after="0" w:before="0" w:line="260"/>
+        <w:ind w:left="140"/>
+      </w:pPr>
+      <w:r>
+        <w:rPr>
+          <w:rFonts w:ascii="Menlo" w:cs="Menlo" w:eastAsia="Menlo" w:hAnsi="Menlo"/>
+          <w:sz w:val="17"/>
+          <w:szCs w:val="17"/>
+        </w:rPr>
+        <w:t xml:space="preserve"> </w:t>
+      </w:r>
+    </w:p>
+    <w:p>
+      <w:pPr>
+        <w:shd w:fill="F4F4F4" w:val="clear"/>
+        <w:spacing w:after="0" w:before="0" w:line="260"/>
+        <w:ind w:left="140"/>
+      </w:pPr>
+      <w:r>
+        <w:rPr>
+          <w:rFonts w:ascii="Menlo" w:cs="Menlo" w:eastAsia="Menlo" w:hAnsi="Menlo"/>
+          <w:sz w:val="17"/>
+          <w:szCs w:val="17"/>
+        </w:rPr>
+        <w:t xml:space="preserve"># Режим розробки</w:t>
+      </w:r>
+    </w:p>
+    <w:p>
+      <w:pPr>
+        <w:shd w:fill="F4F4F4" w:val="clear"/>
+        <w:spacing w:after="0" w:before="0" w:line="260"/>
+        <w:ind w:left="140"/>
+      </w:pPr>
+      <w:r>
+        <w:rPr>
+          <w:rFonts w:ascii="Menlo" w:cs="Menlo" w:eastAsia="Menlo" w:hAnsi="Menlo"/>
+          <w:sz w:val="17"/>
+          <w:szCs w:val="17"/>
+        </w:rPr>
+        <w:t xml:space="preserve">npm run dev poker</w:t>
+      </w:r>
+    </w:p>
+    <w:p>
+      <w:pPr>
+        <w:shd w:fill="F4F4F4" w:val="clear"/>
+        <w:spacing w:after="0" w:before="0" w:line="260"/>
+        <w:ind w:left="140"/>
+      </w:pPr>
+      <w:r>
+        <w:rPr>
+          <w:rFonts w:ascii="Menlo" w:cs="Menlo" w:eastAsia="Menlo" w:hAnsi="Menlo"/>
+          <w:sz w:val="17"/>
+          <w:szCs w:val="17"/>
+        </w:rPr>
+        <w:t xml:space="preserve"> </w:t>
+      </w:r>
+    </w:p>
+    <w:p>
+      <w:pPr>
+        <w:shd w:fill="F4F4F4" w:val="clear"/>
+        <w:spacing w:after="0" w:before="0" w:line="260"/>
+        <w:ind w:left="140"/>
+      </w:pPr>
+      <w:r>
+        <w:rPr>
+          <w:rFonts w:ascii="Menlo" w:cs="Menlo" w:eastAsia="Menlo" w:hAnsi="Menlo"/>
+          <w:sz w:val="17"/>
+          <w:szCs w:val="17"/>
+        </w:rPr>
+        <w:t xml:space="preserve"># Збірка для продакшену — результат у dist/poker/</w:t>
+      </w:r>
+    </w:p>
+    <w:p>
+      <w:pPr>
+        <w:shd w:fill="F4F4F4" w:val="clear"/>
+        <w:spacing w:after="0" w:before="0" w:line="260"/>
+        <w:ind w:left="140"/>
+      </w:pPr>
+      <w:r>
+        <w:rPr>
+          <w:rFonts w:ascii="Menlo" w:cs="Menlo" w:eastAsia="Menlo" w:hAnsi="Menlo"/>
+          <w:sz w:val="17"/>
+          <w:szCs w:val="17"/>
+        </w:rPr>
+        <w:t xml:space="preserve">npm run build poker</w:t>
+      </w:r>
+    </w:p>
+    <w:p>
+      <w:pPr>
+        <w:shd w:fill="F4F4F4" w:val="clear"/>
+        <w:spacing w:after="0" w:before="0" w:line="260"/>
+        <w:ind w:left="140"/>
+      </w:pPr>
+      <w:r>
+        <w:rPr>
+          <w:rFonts w:ascii="Menlo" w:cs="Menlo" w:eastAsia="Menlo" w:hAnsi="Menlo"/>
+          <w:sz w:val="17"/>
+          <w:szCs w:val="17"/>
+        </w:rPr>
+        <w:t xml:space="preserve"> </w:t>
+      </w:r>
+    </w:p>
+    <w:p>
+      <w:pPr>
+        <w:shd w:fill="F4F4F4" w:val="clear"/>
+        <w:spacing w:after="0" w:before="0" w:line="260"/>
+        <w:ind w:left="140"/>
+      </w:pPr>
+      <w:r>
+        <w:rPr>
+          <w:rFonts w:ascii="Menlo" w:cs="Menlo" w:eastAsia="Menlo" w:hAnsi="Menlo"/>
+          <w:sz w:val="17"/>
+          <w:szCs w:val="17"/>
+        </w:rPr>
+        <w:t xml:space="preserve"># Попередній перегляд збірки</w:t>
+      </w:r>
+    </w:p>
+    <w:p>
+      <w:pPr>
+        <w:shd w:fill="F4F4F4" w:val="clear"/>
+        <w:spacing w:after="160" w:before="0" w:line="260"/>
+        <w:ind w:left="140"/>
+      </w:pPr>
+      <w:r>
+        <w:rPr>
+          <w:rFonts w:ascii="Menlo" w:cs="Menlo" w:eastAsia="Menlo" w:hAnsi="Menlo"/>
+          <w:sz w:val="17"/>
+          <w:szCs w:val="17"/>
+        </w:rPr>
+        <w:t xml:space="preserve">npm run preview poker</w:t>
+      </w:r>
+    </w:p>
+    <w:p>
+      <w:pPr>
+        <w:pStyle w:val="Heading1"/>
+      </w:pPr>
+      <w:r>
+        <w:rPr>
+          <w:rFonts w:ascii="Arial" w:cs="Arial" w:eastAsia="Arial" w:hAnsi="Arial"/>
+        </w:rPr>
+        <w:t xml:space="preserve">Підготовка відео</w:t>
+      </w:r>
+    </w:p>
+    <w:p>
+      <w:pPr>
+        <w:spacing w:after="140" w:line="300"/>
+      </w:pPr>
+      <w:r>
+        <w:rPr>
+          <w:rFonts w:ascii="Arial" w:cs="Arial" w:eastAsia="Arial" w:hAnsi="Arial"/>
+          <w:sz w:val="22"/>
+          <w:szCs w:val="22"/>
+        </w:rPr>
+        <w:t xml:space="preserve">Відеофайли вже лежать у репозиторії, у </w:t>
+      </w:r>
+      <w:r>
+        <w:rPr>
+          <w:rFonts w:ascii="Menlo" w:cs="Menlo" w:eastAsia="Menlo" w:hAnsi="Menlo"/>
+          <w:sz w:val="22"/>
+          <w:szCs w:val="22"/>
+          <w:shd w:fill="F0F0F0" w:val="clear"/>
+        </w:rPr>
+        <w:t xml:space="preserve">stories/poker/videos/</w:t>
+      </w:r>
+      <w:r>
+        <w:rPr>
+          <w:rFonts w:ascii="Arial" w:cs="Arial" w:eastAsia="Arial" w:hAnsi="Arial"/>
+          <w:sz w:val="22"/>
+          <w:szCs w:val="22"/>
+        </w:rPr>
+        <w:t xml:space="preserve">. Їх створює скрипт </w:t>
+      </w:r>
+      <w:r>
+        <w:rPr>
+          <w:rFonts w:ascii="Menlo" w:cs="Menlo" w:eastAsia="Menlo" w:hAnsi="Menlo"/>
+          <w:sz w:val="22"/>
+          <w:szCs w:val="22"/>
+          <w:shd w:fill="F0F0F0" w:val="clear"/>
+        </w:rPr>
+        <w:t xml:space="preserve">scripts/encode-story-videos.mjs</w:t>
+      </w:r>
+      <w:r>
+        <w:rPr>
+          <w:rFonts w:ascii="Arial" w:cs="Arial" w:eastAsia="Arial" w:hAnsi="Arial"/>
+          <w:sz w:val="22"/>
+          <w:szCs w:val="22"/>
+        </w:rPr>
+        <w:t xml:space="preserve"> з вихідних файлів дизайнера:</w:t>
+      </w:r>
+    </w:p>
+    <w:p>
+      <w:pPr>
+        <w:shd w:fill="F4F4F4" w:val="clear"/>
+        <w:spacing w:after="160" w:before="80" w:line="260"/>
+        <w:ind w:left="140"/>
+      </w:pPr>
+      <w:r>
+        <w:rPr>
+          <w:rFonts w:ascii="Menlo" w:cs="Menlo" w:eastAsia="Menlo" w:hAnsi="Menlo"/>
+          <w:sz w:val="17"/>
+          <w:szCs w:val="17"/>
+        </w:rPr>
+        <w:t xml:space="preserve">npm run video:encode -- --story poker --src &lt;папка з вихідними файлами&gt;</w:t>
       </w:r>
     </w:p>
     <w:p>
@@ -7708,7 +7990,7 @@
           <w:sz w:val="22"/>
           <w:szCs w:val="22"/>
         </w:rPr>
-        <w:t xml:space="preserve">Потрібен ffmpeg з кодеками AV1, H.265, VP9, H.264, Opus і VMAF (</w:t>
+        <w:t xml:space="preserve">Вихідні файли — по одному MP4 на слайд, 1080×1920, з назвою за номером слайда: </w:t>
       </w:r>
       <w:r>
         <w:rPr>
@@ -7717,26 +7999,49 @@
           <w:szCs w:val="22"/>
           <w:shd w:fill="F0F0F0" w:val="clear"/>
         </w:rPr>
-        <w:t xml:space="preserve">brew install ffmpeg</w:t>
-      </w:r>
-      <w:r>
-        <w:rPr>
-          <w:rFonts w:ascii="Arial" w:cs="Arial" w:eastAsia="Arial" w:hAnsi="Arial"/>
-          <w:sz w:val="22"/>
-          <w:szCs w:val="22"/>
-        </w:rPr>
-        <w:t xml:space="preserve">).</w:t>
-      </w:r>
-    </w:p>
-    <w:p>
-      <w:pPr>
-        <w:pStyle w:val="Heading1"/>
-      </w:pPr>
-      <w:r>
-        <w:rPr>
-          <w:rFonts w:ascii="Arial" w:cs="Arial" w:eastAsia="Arial" w:hAnsi="Arial"/>
-        </w:rPr>
-        <w:t xml:space="preserve">Перевірка</w:t>
+        <w:t xml:space="preserve">1.mp4</w:t>
+      </w:r>
+      <w:r>
+        <w:rPr>
+          <w:rFonts w:ascii="Arial" w:cs="Arial" w:eastAsia="Arial" w:hAnsi="Arial"/>
+          <w:sz w:val="22"/>
+          <w:szCs w:val="22"/>
+        </w:rPr>
+        <w:t xml:space="preserve">, </w:t>
+      </w:r>
+      <w:r>
+        <w:rPr>
+          <w:rFonts w:ascii="Menlo" w:cs="Menlo" w:eastAsia="Menlo" w:hAnsi="Menlo"/>
+          <w:sz w:val="22"/>
+          <w:szCs w:val="22"/>
+          <w:shd w:fill="F0F0F0" w:val="clear"/>
+        </w:rPr>
+        <w:t xml:space="preserve">2.mp4</w:t>
+      </w:r>
+      <w:r>
+        <w:rPr>
+          <w:rFonts w:ascii="Arial" w:cs="Arial" w:eastAsia="Arial" w:hAnsi="Arial"/>
+          <w:sz w:val="22"/>
+          <w:szCs w:val="22"/>
+        </w:rPr>
+        <w:t xml:space="preserve">. Повторна версія називається </w:t>
+      </w:r>
+      <w:r>
+        <w:rPr>
+          <w:rFonts w:ascii="Menlo" w:cs="Menlo" w:eastAsia="Menlo" w:hAnsi="Menlo"/>
+          <w:sz w:val="22"/>
+          <w:szCs w:val="22"/>
+          <w:shd w:fill="F0F0F0" w:val="clear"/>
+        </w:rPr>
+        <w:t xml:space="preserve">2_1.mp4</w:t>
+      </w:r>
+      <w:r>
+        <w:rPr>
+          <w:rFonts w:ascii="Arial" w:cs="Arial" w:eastAsia="Arial" w:hAnsi="Arial"/>
+          <w:sz w:val="22"/>
+          <w:szCs w:val="22"/>
+        </w:rPr>
+        <w:t xml:space="preserve">; з кількох версій береться найновіша. Інші файли в папці пропускаються.</w:t>
       </w:r>
     </w:p>
     <w:p>
@@ -7754,24 +8059,7 @@
           <w:sz w:val="22"/>
           <w:szCs w:val="22"/>
         </w:rPr>
-        <w:t xml:space="preserve">Сторіс відкривається за посиланням із </w:t>
-      </w:r>
-      <w:r>
-        <w:rPr>
-          <w:rFonts w:ascii="Menlo" w:cs="Menlo" w:eastAsia="Menlo" w:hAnsi="Menlo"/>
-          <w:sz w:val="22"/>
-          <w:szCs w:val="22"/>
-          <w:shd w:fill="F0F0F0" w:val="clear"/>
-        </w:rPr>
-        <w:t xml:space="preserve">user_language</w:t>
-      </w:r>
-      <w:r>
-        <w:rPr>
-          <w:rFonts w:ascii="Arial" w:cs="Arial" w:eastAsia="Arial" w:hAnsi="Arial"/>
-          <w:sz w:val="22"/>
-          <w:szCs w:val="22"/>
-        </w:rPr>
-        <w:t xml:space="preserve"> для кожної з 6 мов; тексти відповідають мові.</w:t>
+        <w:t xml:space="preserve">Скрипт створює обидва розміри і всі чотири формати та підбирає стиснення окремо для кожного відео: найменший файл, якість якого не нижча за поріг. Відео обробляються по одному, щоб не перевантажувати комп'ютер.</w:t>
       </w:r>
     </w:p>
     <w:p>
@@ -7789,7 +8077,361 @@
           <w:sz w:val="22"/>
           <w:szCs w:val="22"/>
         </w:rPr>
-        <w:t xml:space="preserve">Відео запускається автоматично без звуку; кнопка звуку вмикає і вимикає звук.</w:t>
+        <w:t xml:space="preserve">Сторіс знаходить файли за назвою кліпу (</w:t>
+      </w:r>
+      <w:r>
+        <w:rPr>
+          <w:rFonts w:ascii="Menlo" w:cs="Menlo" w:eastAsia="Menlo" w:hAnsi="Menlo"/>
+          <w:sz w:val="22"/>
+          <w:szCs w:val="22"/>
+          <w:shd w:fill="F0F0F0" w:val="clear"/>
+        </w:rPr>
+        <w:t xml:space="preserve">story_1</w:t>
+      </w:r>
+      <w:r>
+        <w:rPr>
+          <w:rFonts w:ascii="Arial" w:cs="Arial" w:eastAsia="Arial" w:hAnsi="Arial"/>
+          <w:sz w:val="22"/>
+          <w:szCs w:val="22"/>
+        </w:rPr>
+        <w:t xml:space="preserve">, </w:t>
+      </w:r>
+      <w:r>
+        <w:rPr>
+          <w:rFonts w:ascii="Menlo" w:cs="Menlo" w:eastAsia="Menlo" w:hAnsi="Menlo"/>
+          <w:sz w:val="22"/>
+          <w:szCs w:val="22"/>
+          <w:shd w:fill="F0F0F0" w:val="clear"/>
+        </w:rPr>
+        <w:t xml:space="preserve">story_2</w:t>
+      </w:r>
+      <w:r>
+        <w:rPr>
+          <w:rFonts w:ascii="Arial" w:cs="Arial" w:eastAsia="Arial" w:hAnsi="Arial"/>
+          <w:sz w:val="22"/>
+          <w:szCs w:val="22"/>
+        </w:rPr>
+        <w:t xml:space="preserve">…), тому шляхи до відео в </w:t>
+      </w:r>
+      <w:r>
+        <w:rPr>
+          <w:rFonts w:ascii="Menlo" w:cs="Menlo" w:eastAsia="Menlo" w:hAnsi="Menlo"/>
+          <w:sz w:val="22"/>
+          <w:szCs w:val="22"/>
+          <w:shd w:fill="F0F0F0" w:val="clear"/>
+        </w:rPr>
+        <w:t xml:space="preserve">stories.json</w:t>
+      </w:r>
+      <w:r>
+        <w:rPr>
+          <w:rFonts w:ascii="Arial" w:cs="Arial" w:eastAsia="Arial" w:hAnsi="Arial"/>
+          <w:sz w:val="22"/>
+          <w:szCs w:val="22"/>
+        </w:rPr>
+        <w:t xml:space="preserve"> не прописуються.</w:t>
+      </w:r>
+    </w:p>
+    <w:p>
+      <w:pPr>
+        <w:pStyle w:val="ListParagraph"/>
+        <w:numPr>
+          <w:ilvl w:val="0"/>
+          <w:numId w:val="2"/>
+        </w:numPr>
+        <w:spacing w:after="60"/>
+      </w:pPr>
+      <w:r>
+        <w:rPr>
+          <w:rFonts w:ascii="Arial" w:cs="Arial" w:eastAsia="Arial" w:hAnsi="Arial"/>
+          <w:sz w:val="22"/>
+          <w:szCs w:val="22"/>
+        </w:rPr>
+        <w:t xml:space="preserve">Результати записуються у </w:t>
+      </w:r>
+      <w:r>
+        <w:rPr>
+          <w:rFonts w:ascii="Menlo" w:cs="Menlo" w:eastAsia="Menlo" w:hAnsi="Menlo"/>
+          <w:sz w:val="22"/>
+          <w:szCs w:val="22"/>
+          <w:shd w:fill="F0F0F0" w:val="clear"/>
+        </w:rPr>
+        <w:t xml:space="preserve">stories/poker/video-report.json</w:t>
+      </w:r>
+      <w:r>
+        <w:rPr>
+          <w:rFonts w:ascii="Arial" w:cs="Arial" w:eastAsia="Arial" w:hAnsi="Arial"/>
+          <w:sz w:val="22"/>
+          <w:szCs w:val="22"/>
+        </w:rPr>
+        <w:t xml:space="preserve">: вага, оцінка якості, тип джерела кожного файлу.</w:t>
+      </w:r>
+    </w:p>
+    <w:p>
+      <w:pPr>
+        <w:pStyle w:val="ListParagraph"/>
+        <w:numPr>
+          <w:ilvl w:val="0"/>
+          <w:numId w:val="2"/>
+        </w:numPr>
+        <w:spacing w:after="60"/>
+      </w:pPr>
+      <w:r>
+        <w:rPr>
+          <w:rFonts w:ascii="Arial" w:cs="Arial" w:eastAsia="Arial" w:hAnsi="Arial"/>
+          <w:sz w:val="22"/>
+          <w:szCs w:val="22"/>
+        </w:rPr>
+        <w:t xml:space="preserve">Потрібен ffmpeg з кодеками AV1, H.265, VP9, H.264, Opus і VMAF (</w:t>
+      </w:r>
+      <w:r>
+        <w:rPr>
+          <w:rFonts w:ascii="Menlo" w:cs="Menlo" w:eastAsia="Menlo" w:hAnsi="Menlo"/>
+          <w:sz w:val="22"/>
+          <w:szCs w:val="22"/>
+          <w:shd w:fill="F0F0F0" w:val="clear"/>
+        </w:rPr>
+        <w:t xml:space="preserve">brew install ffmpeg</w:t>
+      </w:r>
+      <w:r>
+        <w:rPr>
+          <w:rFonts w:ascii="Arial" w:cs="Arial" w:eastAsia="Arial" w:hAnsi="Arial"/>
+          <w:sz w:val="22"/>
+          <w:szCs w:val="22"/>
+        </w:rPr>
+        <w:t xml:space="preserve">).</w:t>
+      </w:r>
+    </w:p>
+    <w:p>
+      <w:pPr>
+        <w:spacing w:after="140" w:line="300"/>
+      </w:pPr>
+      <w:r>
+        <w:rPr>
+          <w:rFonts w:ascii="Arial" w:cs="Arial" w:eastAsia="Arial" w:hAnsi="Arial"/>
+          <w:sz w:val="22"/>
+          <w:szCs w:val="22"/>
+        </w:rPr>
+        <w:t xml:space="preserve">Музику створює скрипт </w:t>
+      </w:r>
+      <w:r>
+        <w:rPr>
+          <w:rFonts w:ascii="Menlo" w:cs="Menlo" w:eastAsia="Menlo" w:hAnsi="Menlo"/>
+          <w:sz w:val="22"/>
+          <w:szCs w:val="22"/>
+          <w:shd w:fill="F0F0F0" w:val="clear"/>
+        </w:rPr>
+        <w:t xml:space="preserve">scripts/build-story-soundtrack.mjs</w:t>
+      </w:r>
+      <w:r>
+        <w:rPr>
+          <w:rFonts w:ascii="Arial" w:cs="Arial" w:eastAsia="Arial" w:hAnsi="Arial"/>
+          <w:sz w:val="22"/>
+          <w:szCs w:val="22"/>
+        </w:rPr>
+        <w:t xml:space="preserve"> зі звуку тих самих вихідних файлів. Запускається після відео:</w:t>
+      </w:r>
+    </w:p>
+    <w:p>
+      <w:pPr>
+        <w:shd w:fill="F4F4F4" w:val="clear"/>
+        <w:spacing w:after="160" w:before="80" w:line="260"/>
+        <w:ind w:left="140"/>
+      </w:pPr>
+      <w:r>
+        <w:rPr>
+          <w:rFonts w:ascii="Menlo" w:cs="Menlo" w:eastAsia="Menlo" w:hAnsi="Menlo"/>
+          <w:sz w:val="17"/>
+          <w:szCs w:val="17"/>
+        </w:rPr>
+        <w:t xml:space="preserve">npm run audio:build -- --story poker --src &lt;папка з вихідними файлами&gt;</w:t>
+      </w:r>
+    </w:p>
+    <w:p>
+      <w:pPr>
+        <w:pStyle w:val="ListParagraph"/>
+        <w:numPr>
+          <w:ilvl w:val="0"/>
+          <w:numId w:val="2"/>
+        </w:numPr>
+        <w:spacing w:after="60"/>
+      </w:pPr>
+      <w:r>
+        <w:rPr>
+          <w:rFonts w:ascii="Arial" w:cs="Arial" w:eastAsia="Arial" w:hAnsi="Arial"/>
+          <w:sz w:val="22"/>
+          <w:szCs w:val="22"/>
+        </w:rPr>
+        <w:t xml:space="preserve">Скрипт склеює звук семи відео в одну доріжку, прибирає звук із самих відео і записує в </w:t>
+      </w:r>
+      <w:r>
+        <w:rPr>
+          <w:rFonts w:ascii="Menlo" w:cs="Menlo" w:eastAsia="Menlo" w:hAnsi="Menlo"/>
+          <w:sz w:val="22"/>
+          <w:szCs w:val="22"/>
+          <w:shd w:fill="F0F0F0" w:val="clear"/>
+        </w:rPr>
+        <w:t xml:space="preserve">stories/poker/audio/</w:t>
+      </w:r>
+      <w:r>
+        <w:rPr>
+          <w:rFonts w:ascii="Arial" w:cs="Arial" w:eastAsia="Arial" w:hAnsi="Arial"/>
+          <w:sz w:val="22"/>
+          <w:szCs w:val="22"/>
+        </w:rPr>
+        <w:t xml:space="preserve"> два файли музики та </w:t>
+      </w:r>
+      <w:r>
+        <w:rPr>
+          <w:rFonts w:ascii="Menlo" w:cs="Menlo" w:eastAsia="Menlo" w:hAnsi="Menlo"/>
+          <w:sz w:val="22"/>
+          <w:szCs w:val="22"/>
+          <w:shd w:fill="F0F0F0" w:val="clear"/>
+        </w:rPr>
+        <w:t xml:space="preserve">soundtrack.json</w:t>
+      </w:r>
+      <w:r>
+        <w:rPr>
+          <w:rFonts w:ascii="Arial" w:cs="Arial" w:eastAsia="Arial" w:hAnsi="Arial"/>
+          <w:sz w:val="22"/>
+          <w:szCs w:val="22"/>
+        </w:rPr>
+        <w:t xml:space="preserve"> — де в доріжці починається кожен слайд.</w:t>
+      </w:r>
+    </w:p>
+    <w:p>
+      <w:pPr>
+        <w:pStyle w:val="ListParagraph"/>
+        <w:numPr>
+          <w:ilvl w:val="0"/>
+          <w:numId w:val="2"/>
+        </w:numPr>
+        <w:spacing w:after="60"/>
+      </w:pPr>
+      <w:r>
+        <w:rPr>
+          <w:rFonts w:ascii="Arial" w:cs="Arial" w:eastAsia="Arial" w:hAnsi="Arial"/>
+          <w:sz w:val="22"/>
+          <w:szCs w:val="22"/>
+        </w:rPr>
+        <w:t xml:space="preserve">На трьох стиках вихідних відео бракує 7–8 кадрів музики. Скрипт відновлює їх із такого самого місця мелодії, яка повторюється, тож ритм на стиках не збивається.</w:t>
+      </w:r>
+    </w:p>
+    <w:p>
+      <w:pPr>
+        <w:pStyle w:val="ListParagraph"/>
+        <w:numPr>
+          <w:ilvl w:val="0"/>
+          <w:numId w:val="2"/>
+        </w:numPr>
+        <w:spacing w:after="60"/>
+      </w:pPr>
+      <w:r>
+        <w:rPr>
+          <w:rFonts w:ascii="Arial" w:cs="Arial" w:eastAsia="Arial" w:hAnsi="Arial"/>
+          <w:sz w:val="22"/>
+          <w:szCs w:val="22"/>
+        </w:rPr>
+        <w:t xml:space="preserve">Відео без звуку скрипт записує так, щоб кожен кадр лежав у файлі окремим блоком, як у відео зі звуком. Інакше Safari перед показом чекає, поки завантажиться великий шматок файлу, і на iPhone кожен перехід затримується на 1,5–5 секунд. Збірка перевіряє це для кожного відео.</w:t>
+      </w:r>
+    </w:p>
+    <w:p>
+      <w:pPr>
+        <w:pStyle w:val="ListParagraph"/>
+        <w:numPr>
+          <w:ilvl w:val="0"/>
+          <w:numId w:val="2"/>
+        </w:numPr>
+        <w:spacing w:after="60"/>
+      </w:pPr>
+      <w:r>
+        <w:rPr>
+          <w:rFonts w:ascii="Arial" w:cs="Arial" w:eastAsia="Arial" w:hAnsi="Arial"/>
+          <w:sz w:val="22"/>
+          <w:szCs w:val="22"/>
+        </w:rPr>
+        <w:t xml:space="preserve">Після нового кодування відео скрипт запускається знову. Доки музика не відповідає відео, збірка зупиняється з підказкою.</w:t>
+      </w:r>
+    </w:p>
+    <w:p>
+      <w:pPr>
+        <w:pStyle w:val="Heading1"/>
+      </w:pPr>
+      <w:r>
+        <w:rPr>
+          <w:rFonts w:ascii="Arial" w:cs="Arial" w:eastAsia="Arial" w:hAnsi="Arial"/>
+        </w:rPr>
+        <w:t xml:space="preserve">Перевірка</w:t>
+      </w:r>
+    </w:p>
+    <w:p>
+      <w:pPr>
+        <w:pStyle w:val="ListParagraph"/>
+        <w:numPr>
+          <w:ilvl w:val="0"/>
+          <w:numId w:val="2"/>
+        </w:numPr>
+        <w:spacing w:after="60"/>
+      </w:pPr>
+      <w:r>
+        <w:rPr>
+          <w:rFonts w:ascii="Arial" w:cs="Arial" w:eastAsia="Arial" w:hAnsi="Arial"/>
+          <w:sz w:val="22"/>
+          <w:szCs w:val="22"/>
+        </w:rPr>
+        <w:t xml:space="preserve">Сторіс відкривається за посиланням із </w:t>
+      </w:r>
+      <w:r>
+        <w:rPr>
+          <w:rFonts w:ascii="Menlo" w:cs="Menlo" w:eastAsia="Menlo" w:hAnsi="Menlo"/>
+          <w:sz w:val="22"/>
+          <w:szCs w:val="22"/>
+          <w:shd w:fill="F0F0F0" w:val="clear"/>
+        </w:rPr>
+        <w:t xml:space="preserve">user_language</w:t>
+      </w:r>
+      <w:r>
+        <w:rPr>
+          <w:rFonts w:ascii="Arial" w:cs="Arial" w:eastAsia="Arial" w:hAnsi="Arial"/>
+          <w:sz w:val="22"/>
+          <w:szCs w:val="22"/>
+        </w:rPr>
+        <w:t xml:space="preserve"> для кожної з 6 мов; тексти відповідають мові.</w:t>
+      </w:r>
+    </w:p>
+    <w:p>
+      <w:pPr>
+        <w:pStyle w:val="ListParagraph"/>
+        <w:numPr>
+          <w:ilvl w:val="0"/>
+          <w:numId w:val="2"/>
+        </w:numPr>
+        <w:spacing w:after="60"/>
+      </w:pPr>
+      <w:r>
+        <w:rPr>
+          <w:rFonts w:ascii="Arial" w:cs="Arial" w:eastAsia="Arial" w:hAnsi="Arial"/>
+          <w:sz w:val="22"/>
+          <w:szCs w:val="22"/>
+        </w:rPr>
+        <w:t xml:space="preserve">Відео запускається автоматично без звуку; кнопка звуку вмикає і вимикає музику.</w:t>
+      </w:r>
+    </w:p>
+    <w:p>
+      <w:pPr>
+        <w:pStyle w:val="ListParagraph"/>
+        <w:numPr>
+          <w:ilvl w:val="0"/>
+          <w:numId w:val="2"/>
+        </w:numPr>
+        <w:spacing w:after="60"/>
+      </w:pPr>
+      <w:r>
+        <w:rPr>
+          <w:rFonts w:ascii="Arial" w:cs="Arial" w:eastAsia="Arial" w:hAnsi="Arial"/>
+          <w:sz w:val="22"/>
+          <w:szCs w:val="22"/>
+        </w:rPr>
+        <w:t xml:space="preserve">Під час переходу між слайдами — автоматично, тапом і стрілками — музика не переривається; пауза й утримання екрана зупиняють її разом із відео.</w:t>
       </w:r>
     </w:p>
     <w:p>

</xml_diff>